<commit_message>
Complete mapping tables and add second lesson plan (decomposition)
Mapping document: add the identification strip (student, class, ID,
birth date, school, homeroom teacher), the 1000-range and procedure
rows in the addition/subtraction rating tables, and full
multiplication, division and order-of-operations rating sections so
every row of the official template is covered.

New separate lesson plan for lesson 3 (decomposition: one ten = 10
ones) in the official template, same expanded structure: rationale
tied to the mapping, staged 45-minute table with mediation scripts,
filled execution/reflection columns, anticipated difficulties,
differentiation, assessment and sources.

Co-Authored-By: Claude Fable 5 <noreply@anthropic.com>
Claude-Session: https://claude.ai/code/session_01EMxFUHHVvpa8bYzfYkV3bj
</commit_message>
<xml_diff>
--- a/lesson-plan/מיפוי-ותוכנית-עבודה.docx
+++ b/lesson-plan/מיפוי-ותוכנית-עבודה.docx
@@ -5746,6 +5746,400 @@
         </w:tblBorders>
       </w:tblPr>
       <w:tblGrid>
+        <w:gridCol w:w="1440"/>
+        <w:gridCol w:w="1650"/>
+        <w:gridCol w:w="1440"/>
+        <w:gridCol w:w="1650"/>
+        <w:gridCol w:w="1440"/>
+        <w:gridCol w:w="1640"/>
+      </w:tblGrid>
+      <w:tr>
+        <w:tc>
+          <w:tcPr>
+            <w:tcW w:type="dxa" w:w="1440"/>
+            <w:shd w:fill="D9E2F3" w:color="auto" w:val="clear"/>
+            <w:tcMar>
+              <w:top w:type="dxa" w:w="60"/>
+              <w:left w:type="dxa" w:w="90"/>
+              <w:bottom w:type="dxa" w:w="60"/>
+              <w:right w:type="dxa" w:w="90"/>
+            </w:tcMar>
+            <w:vAlign w:val="center"/>
+          </w:tcPr>
+          <w:p>
+            <w:pPr>
+              <w:bidi/>
+              <w:spacing w:after="40"/>
+              <w:jc w:val="start"/>
+            </w:pPr>
+            <w:r>
+              <w:rPr>
+                <w:rFonts w:ascii="David" w:cs="David" w:eastAsia="David" w:hAnsi="David"/>
+                <w:b/>
+                <w:bCs/>
+                <w:sz w:val="20"/>
+                <w:szCs w:val="20"/>
+                <w:rtl/>
+              </w:rPr>
+              <w:t xml:space="preserve">שם התלמיד/ה</w:t>
+            </w:r>
+          </w:p>
+        </w:tc>
+        <w:tc>
+          <w:tcPr>
+            <w:tcW w:type="dxa" w:w="1650"/>
+            <w:tcMar>
+              <w:top w:type="dxa" w:w="60"/>
+              <w:left w:type="dxa" w:w="90"/>
+              <w:bottom w:type="dxa" w:w="60"/>
+              <w:right w:type="dxa" w:w="90"/>
+            </w:tcMar>
+            <w:vAlign w:val="center"/>
+          </w:tcPr>
+          <w:p>
+            <w:pPr>
+              <w:bidi/>
+              <w:spacing w:after="40"/>
+              <w:jc w:val="start"/>
+            </w:pPr>
+            <w:r>
+              <w:rPr>
+                <w:rFonts w:ascii="David" w:cs="David" w:eastAsia="David" w:hAnsi="David"/>
+                <w:sz w:val="20"/>
+                <w:szCs w:val="20"/>
+                <w:rtl/>
+              </w:rPr>
+              <w:t xml:space="preserve">יובל (שם בדוי)</w:t>
+            </w:r>
+          </w:p>
+        </w:tc>
+        <w:tc>
+          <w:tcPr>
+            <w:tcW w:type="dxa" w:w="1440"/>
+            <w:shd w:fill="D9E2F3" w:color="auto" w:val="clear"/>
+            <w:tcMar>
+              <w:top w:type="dxa" w:w="60"/>
+              <w:left w:type="dxa" w:w="90"/>
+              <w:bottom w:type="dxa" w:w="60"/>
+              <w:right w:type="dxa" w:w="90"/>
+            </w:tcMar>
+            <w:vAlign w:val="center"/>
+          </w:tcPr>
+          <w:p>
+            <w:pPr>
+              <w:bidi/>
+              <w:spacing w:after="40"/>
+              <w:jc w:val="start"/>
+            </w:pPr>
+            <w:r>
+              <w:rPr>
+                <w:rFonts w:ascii="David" w:cs="David" w:eastAsia="David" w:hAnsi="David"/>
+                <w:b/>
+                <w:bCs/>
+                <w:sz w:val="20"/>
+                <w:szCs w:val="20"/>
+                <w:rtl/>
+              </w:rPr>
+              <w:t xml:space="preserve">כיתה</w:t>
+            </w:r>
+          </w:p>
+        </w:tc>
+        <w:tc>
+          <w:tcPr>
+            <w:tcW w:type="dxa" w:w="1650"/>
+            <w:tcMar>
+              <w:top w:type="dxa" w:w="60"/>
+              <w:left w:type="dxa" w:w="90"/>
+              <w:bottom w:type="dxa" w:w="60"/>
+              <w:right w:type="dxa" w:w="90"/>
+            </w:tcMar>
+            <w:vAlign w:val="center"/>
+          </w:tcPr>
+          <w:p>
+            <w:pPr>
+              <w:bidi/>
+              <w:spacing w:after="40"/>
+              <w:jc w:val="start"/>
+            </w:pPr>
+            <w:r>
+              <w:rPr>
+                <w:rFonts w:ascii="David" w:cs="David" w:eastAsia="David" w:hAnsi="David"/>
+                <w:sz w:val="20"/>
+                <w:szCs w:val="20"/>
+                <w:rtl/>
+              </w:rPr>
+              <w:t xml:space="preserve">ג'2</w:t>
+            </w:r>
+          </w:p>
+        </w:tc>
+        <w:tc>
+          <w:tcPr>
+            <w:tcW w:type="dxa" w:w="1440"/>
+            <w:shd w:fill="D9E2F3" w:color="auto" w:val="clear"/>
+            <w:tcMar>
+              <w:top w:type="dxa" w:w="60"/>
+              <w:left w:type="dxa" w:w="90"/>
+              <w:bottom w:type="dxa" w:w="60"/>
+              <w:right w:type="dxa" w:w="90"/>
+            </w:tcMar>
+            <w:vAlign w:val="center"/>
+          </w:tcPr>
+          <w:p>
+            <w:pPr>
+              <w:bidi/>
+              <w:spacing w:after="40"/>
+              <w:jc w:val="start"/>
+            </w:pPr>
+            <w:r>
+              <w:rPr>
+                <w:rFonts w:ascii="David" w:cs="David" w:eastAsia="David" w:hAnsi="David"/>
+                <w:b/>
+                <w:bCs/>
+                <w:sz w:val="20"/>
+                <w:szCs w:val="20"/>
+                <w:rtl/>
+              </w:rPr>
+              <w:t xml:space="preserve">ת.ז.</w:t>
+            </w:r>
+          </w:p>
+        </w:tc>
+        <w:tc>
+          <w:tcPr>
+            <w:tcW w:type="dxa" w:w="1640"/>
+            <w:tcMar>
+              <w:top w:type="dxa" w:w="60"/>
+              <w:left w:type="dxa" w:w="90"/>
+              <w:bottom w:type="dxa" w:w="60"/>
+              <w:right w:type="dxa" w:w="90"/>
+            </w:tcMar>
+            <w:vAlign w:val="center"/>
+          </w:tcPr>
+          <w:p>
+            <w:pPr>
+              <w:bidi/>
+              <w:spacing w:after="40"/>
+              <w:jc w:val="start"/>
+            </w:pPr>
+            <w:r>
+              <w:rPr>
+                <w:rFonts w:ascii="David" w:cs="David" w:eastAsia="David" w:hAnsi="David"/>
+                <w:sz w:val="20"/>
+                <w:szCs w:val="20"/>
+                <w:rtl/>
+              </w:rPr>
+              <w:t xml:space="preserve">214365879 (בדוי)</w:t>
+            </w:r>
+          </w:p>
+        </w:tc>
+      </w:tr>
+      <w:tr>
+        <w:tc>
+          <w:tcPr>
+            <w:tcW w:type="dxa" w:w="1440"/>
+            <w:shd w:fill="D9E2F3" w:color="auto" w:val="clear"/>
+            <w:tcMar>
+              <w:top w:type="dxa" w:w="60"/>
+              <w:left w:type="dxa" w:w="90"/>
+              <w:bottom w:type="dxa" w:w="60"/>
+              <w:right w:type="dxa" w:w="90"/>
+            </w:tcMar>
+            <w:vAlign w:val="center"/>
+          </w:tcPr>
+          <w:p>
+            <w:pPr>
+              <w:bidi/>
+              <w:spacing w:after="40"/>
+              <w:jc w:val="start"/>
+            </w:pPr>
+            <w:r>
+              <w:rPr>
+                <w:rFonts w:ascii="David" w:cs="David" w:eastAsia="David" w:hAnsi="David"/>
+                <w:b/>
+                <w:bCs/>
+                <w:sz w:val="20"/>
+                <w:szCs w:val="20"/>
+                <w:rtl/>
+              </w:rPr>
+              <w:t xml:space="preserve">ת.ל.</w:t>
+            </w:r>
+          </w:p>
+        </w:tc>
+        <w:tc>
+          <w:tcPr>
+            <w:tcW w:type="dxa" w:w="1650"/>
+            <w:tcMar>
+              <w:top w:type="dxa" w:w="60"/>
+              <w:left w:type="dxa" w:w="90"/>
+              <w:bottom w:type="dxa" w:w="60"/>
+              <w:right w:type="dxa" w:w="90"/>
+            </w:tcMar>
+            <w:vAlign w:val="center"/>
+          </w:tcPr>
+          <w:p>
+            <w:pPr>
+              <w:bidi/>
+              <w:spacing w:after="40"/>
+              <w:jc w:val="start"/>
+            </w:pPr>
+            <w:r>
+              <w:rPr>
+                <w:rFonts w:ascii="David" w:cs="David" w:eastAsia="David" w:hAnsi="David"/>
+                <w:sz w:val="20"/>
+                <w:szCs w:val="20"/>
+                <w:rtl/>
+              </w:rPr>
+              <w:t xml:space="preserve">12.3.2017</w:t>
+            </w:r>
+          </w:p>
+        </w:tc>
+        <w:tc>
+          <w:tcPr>
+            <w:tcW w:type="dxa" w:w="1440"/>
+            <w:shd w:fill="D9E2F3" w:color="auto" w:val="clear"/>
+            <w:tcMar>
+              <w:top w:type="dxa" w:w="60"/>
+              <w:left w:type="dxa" w:w="90"/>
+              <w:bottom w:type="dxa" w:w="60"/>
+              <w:right w:type="dxa" w:w="90"/>
+            </w:tcMar>
+            <w:vAlign w:val="center"/>
+          </w:tcPr>
+          <w:p>
+            <w:pPr>
+              <w:bidi/>
+              <w:spacing w:after="40"/>
+              <w:jc w:val="start"/>
+            </w:pPr>
+            <w:r>
+              <w:rPr>
+                <w:rFonts w:ascii="David" w:cs="David" w:eastAsia="David" w:hAnsi="David"/>
+                <w:b/>
+                <w:bCs/>
+                <w:sz w:val="20"/>
+                <w:szCs w:val="20"/>
+                <w:rtl/>
+              </w:rPr>
+              <w:t xml:space="preserve">בי"ס</w:t>
+            </w:r>
+          </w:p>
+        </w:tc>
+        <w:tc>
+          <w:tcPr>
+            <w:tcW w:type="dxa" w:w="1650"/>
+            <w:tcMar>
+              <w:top w:type="dxa" w:w="60"/>
+              <w:left w:type="dxa" w:w="90"/>
+              <w:bottom w:type="dxa" w:w="60"/>
+              <w:right w:type="dxa" w:w="90"/>
+            </w:tcMar>
+            <w:vAlign w:val="center"/>
+          </w:tcPr>
+          <w:p>
+            <w:pPr>
+              <w:bidi/>
+              <w:spacing w:after="40"/>
+              <w:jc w:val="start"/>
+            </w:pPr>
+            <w:r>
+              <w:rPr>
+                <w:rFonts w:ascii="David" w:cs="David" w:eastAsia="David" w:hAnsi="David"/>
+                <w:sz w:val="20"/>
+                <w:szCs w:val="20"/>
+                <w:rtl/>
+              </w:rPr>
+              <w:t xml:space="preserve">יסודי "ניצנים"</w:t>
+            </w:r>
+          </w:p>
+        </w:tc>
+        <w:tc>
+          <w:tcPr>
+            <w:tcW w:type="dxa" w:w="1440"/>
+            <w:shd w:fill="D9E2F3" w:color="auto" w:val="clear"/>
+            <w:tcMar>
+              <w:top w:type="dxa" w:w="60"/>
+              <w:left w:type="dxa" w:w="90"/>
+              <w:bottom w:type="dxa" w:w="60"/>
+              <w:right w:type="dxa" w:w="90"/>
+            </w:tcMar>
+            <w:vAlign w:val="center"/>
+          </w:tcPr>
+          <w:p>
+            <w:pPr>
+              <w:bidi/>
+              <w:spacing w:after="40"/>
+              <w:jc w:val="start"/>
+            </w:pPr>
+            <w:r>
+              <w:rPr>
+                <w:rFonts w:ascii="David" w:cs="David" w:eastAsia="David" w:hAnsi="David"/>
+                <w:b/>
+                <w:bCs/>
+                <w:sz w:val="20"/>
+                <w:szCs w:val="20"/>
+                <w:rtl/>
+              </w:rPr>
+              <w:t xml:space="preserve">שם המחנכת</w:t>
+            </w:r>
+          </w:p>
+        </w:tc>
+        <w:tc>
+          <w:tcPr>
+            <w:tcW w:type="dxa" w:w="1640"/>
+            <w:tcMar>
+              <w:top w:type="dxa" w:w="60"/>
+              <w:left w:type="dxa" w:w="90"/>
+              <w:bottom w:type="dxa" w:w="60"/>
+              <w:right w:type="dxa" w:w="90"/>
+            </w:tcMar>
+            <w:vAlign w:val="center"/>
+          </w:tcPr>
+          <w:p>
+            <w:pPr>
+              <w:bidi/>
+              <w:spacing w:after="40"/>
+              <w:jc w:val="start"/>
+            </w:pPr>
+            <w:r>
+              <w:rPr>
+                <w:rFonts w:ascii="David" w:cs="David" w:eastAsia="David" w:hAnsi="David"/>
+                <w:sz w:val="20"/>
+                <w:szCs w:val="20"/>
+                <w:rtl/>
+              </w:rPr>
+              <w:t xml:space="preserve">לימור</w:t>
+            </w:r>
+          </w:p>
+        </w:tc>
+      </w:tr>
+    </w:tbl>
+    <w:p>
+      <w:pPr>
+        <w:bidi/>
+        <w:spacing w:after="60" w:before="0"/>
+        <w:jc w:val="start"/>
+      </w:pPr>
+      <w:r>
+        <w:rPr>
+          <w:rFonts w:ascii="David" w:cs="David" w:eastAsia="David" w:hAnsi="David"/>
+          <w:rtl/>
+        </w:rPr>
+        <w:t xml:space="preserve"/>
+      </w:r>
+    </w:p>
+    <w:tbl>
+      <w:tblPr>
+        <w:bidiVisual/>
+        <w:tblW w:type="dxa" w:w="9260"/>
+        <w:tblBorders>
+          <w:top w:val="single" w:color="auto" w:sz="4"/>
+          <w:left w:val="single" w:color="auto" w:sz="4"/>
+          <w:bottom w:val="single" w:color="auto" w:sz="4"/>
+          <w:right w:val="single" w:color="auto" w:sz="4"/>
+          <w:insideH w:val="single" w:color="auto" w:sz="4"/>
+          <w:insideV w:val="single" w:color="auto" w:sz="4"/>
+        </w:tblBorders>
+      </w:tblPr>
+      <w:tblGrid>
         <w:gridCol w:w="3900"/>
         <w:gridCol w:w="900"/>
         <w:gridCol w:w="900"/>
@@ -13773,6 +14167,238 @@
                 <w:szCs w:val="20"/>
                 <w:rtl/>
               </w:rPr>
+              <w:t xml:space="preserve">פותר תרגילי חיבור בתחום ה-1000 ומעלה ללא המרה ועם המרה</w:t>
+            </w:r>
+          </w:p>
+        </w:tc>
+        <w:tc>
+          <w:tcPr>
+            <w:tcW w:type="dxa" w:w="1030"/>
+            <w:tcMar>
+              <w:top w:type="dxa" w:w="60"/>
+              <w:left w:type="dxa" w:w="90"/>
+              <w:bottom w:type="dxa" w:w="60"/>
+              <w:right w:type="dxa" w:w="90"/>
+            </w:tcMar>
+            <w:vAlign w:val="center"/>
+          </w:tcPr>
+          <w:p>
+            <w:pPr>
+              <w:bidi/>
+              <w:spacing w:after="40"/>
+              <w:jc w:val="center"/>
+            </w:pPr>
+            <w:r>
+              <w:rPr>
+                <w:rFonts w:ascii="David" w:cs="David" w:eastAsia="David" w:hAnsi="David"/>
+                <w:b/>
+                <w:bCs/>
+                <w:sz w:val="20"/>
+                <w:szCs w:val="20"/>
+                <w:rtl/>
+              </w:rPr>
+              <w:t xml:space="preserve">טרם נלמד</w:t>
+            </w:r>
+          </w:p>
+        </w:tc>
+        <w:tc>
+          <w:tcPr>
+            <w:tcW w:type="dxa" w:w="1030"/>
+            <w:tcMar>
+              <w:top w:type="dxa" w:w="60"/>
+              <w:left w:type="dxa" w:w="90"/>
+              <w:bottom w:type="dxa" w:w="60"/>
+              <w:right w:type="dxa" w:w="90"/>
+            </w:tcMar>
+            <w:vAlign w:val="center"/>
+          </w:tcPr>
+          <w:p>
+            <w:pPr>
+              <w:bidi/>
+              <w:spacing w:after="40"/>
+              <w:jc w:val="start"/>
+            </w:pPr>
+            <w:r>
+              <w:rPr>
+                <w:rFonts w:ascii="David" w:cs="David" w:eastAsia="David" w:hAnsi="David"/>
+                <w:sz w:val="20"/>
+                <w:szCs w:val="20"/>
+                <w:rtl/>
+              </w:rPr>
+              <w:t xml:space="preserve"/>
+            </w:r>
+          </w:p>
+        </w:tc>
+        <w:tc>
+          <w:tcPr>
+            <w:tcW w:type="dxa" w:w="1040"/>
+            <w:tcMar>
+              <w:top w:type="dxa" w:w="60"/>
+              <w:left w:type="dxa" w:w="90"/>
+              <w:bottom w:type="dxa" w:w="60"/>
+              <w:right w:type="dxa" w:w="90"/>
+            </w:tcMar>
+            <w:vAlign w:val="center"/>
+          </w:tcPr>
+          <w:p>
+            <w:pPr>
+              <w:bidi/>
+              <w:spacing w:after="40"/>
+              <w:jc w:val="start"/>
+            </w:pPr>
+            <w:r>
+              <w:rPr>
+                <w:rFonts w:ascii="David" w:cs="David" w:eastAsia="David" w:hAnsi="David"/>
+                <w:sz w:val="20"/>
+                <w:szCs w:val="20"/>
+                <w:rtl/>
+              </w:rPr>
+              <w:t xml:space="preserve"/>
+            </w:r>
+          </w:p>
+        </w:tc>
+      </w:tr>
+      <w:tr>
+        <w:tc>
+          <w:tcPr>
+            <w:tcW w:type="dxa" w:w="6160"/>
+            <w:tcMar>
+              <w:top w:type="dxa" w:w="60"/>
+              <w:left w:type="dxa" w:w="90"/>
+              <w:bottom w:type="dxa" w:w="60"/>
+              <w:right w:type="dxa" w:w="90"/>
+            </w:tcMar>
+            <w:vAlign w:val="center"/>
+          </w:tcPr>
+          <w:p>
+            <w:pPr>
+              <w:bidi/>
+              <w:spacing w:after="40"/>
+              <w:jc w:val="start"/>
+            </w:pPr>
+            <w:r>
+              <w:rPr>
+                <w:rFonts w:ascii="David" w:cs="David" w:eastAsia="David" w:hAnsi="David"/>
+                <w:sz w:val="20"/>
+                <w:szCs w:val="20"/>
+                <w:rtl/>
+              </w:rPr>
+              <w:t xml:space="preserve">יודע לבצע פרוצדורות (חישובים) בהתאם לתוכנית הלימודים: חיבור במאונך ובמאוזן בתחום ה-100</w:t>
+            </w:r>
+          </w:p>
+        </w:tc>
+        <w:tc>
+          <w:tcPr>
+            <w:tcW w:type="dxa" w:w="1030"/>
+            <w:tcMar>
+              <w:top w:type="dxa" w:w="60"/>
+              <w:left w:type="dxa" w:w="90"/>
+              <w:bottom w:type="dxa" w:w="60"/>
+              <w:right w:type="dxa" w:w="90"/>
+            </w:tcMar>
+            <w:vAlign w:val="center"/>
+          </w:tcPr>
+          <w:p>
+            <w:pPr>
+              <w:bidi/>
+              <w:spacing w:after="40"/>
+              <w:jc w:val="center"/>
+            </w:pPr>
+            <w:r>
+              <w:rPr>
+                <w:rFonts w:ascii="David" w:cs="David" w:eastAsia="David" w:hAnsi="David"/>
+                <w:b/>
+                <w:bCs/>
+                <w:sz w:val="20"/>
+                <w:szCs w:val="20"/>
+                <w:rtl/>
+              </w:rPr>
+              <w:t xml:space="preserve">2</w:t>
+            </w:r>
+          </w:p>
+        </w:tc>
+        <w:tc>
+          <w:tcPr>
+            <w:tcW w:type="dxa" w:w="1030"/>
+            <w:tcMar>
+              <w:top w:type="dxa" w:w="60"/>
+              <w:left w:type="dxa" w:w="90"/>
+              <w:bottom w:type="dxa" w:w="60"/>
+              <w:right w:type="dxa" w:w="90"/>
+            </w:tcMar>
+            <w:vAlign w:val="center"/>
+          </w:tcPr>
+          <w:p>
+            <w:pPr>
+              <w:bidi/>
+              <w:spacing w:after="40"/>
+              <w:jc w:val="start"/>
+            </w:pPr>
+            <w:r>
+              <w:rPr>
+                <w:rFonts w:ascii="David" w:cs="David" w:eastAsia="David" w:hAnsi="David"/>
+                <w:sz w:val="20"/>
+                <w:szCs w:val="20"/>
+                <w:rtl/>
+              </w:rPr>
+              <w:t xml:space="preserve"/>
+            </w:r>
+          </w:p>
+        </w:tc>
+        <w:tc>
+          <w:tcPr>
+            <w:tcW w:type="dxa" w:w="1040"/>
+            <w:tcMar>
+              <w:top w:type="dxa" w:w="60"/>
+              <w:left w:type="dxa" w:w="90"/>
+              <w:bottom w:type="dxa" w:w="60"/>
+              <w:right w:type="dxa" w:w="90"/>
+            </w:tcMar>
+            <w:vAlign w:val="center"/>
+          </w:tcPr>
+          <w:p>
+            <w:pPr>
+              <w:bidi/>
+              <w:spacing w:after="40"/>
+              <w:jc w:val="start"/>
+            </w:pPr>
+            <w:r>
+              <w:rPr>
+                <w:rFonts w:ascii="David" w:cs="David" w:eastAsia="David" w:hAnsi="David"/>
+                <w:sz w:val="20"/>
+                <w:szCs w:val="20"/>
+                <w:rtl/>
+              </w:rPr>
+              <w:t xml:space="preserve"/>
+            </w:r>
+          </w:p>
+        </w:tc>
+      </w:tr>
+      <w:tr>
+        <w:tc>
+          <w:tcPr>
+            <w:tcW w:type="dxa" w:w="6160"/>
+            <w:tcMar>
+              <w:top w:type="dxa" w:w="60"/>
+              <w:left w:type="dxa" w:w="90"/>
+              <w:bottom w:type="dxa" w:w="60"/>
+              <w:right w:type="dxa" w:w="90"/>
+            </w:tcMar>
+            <w:vAlign w:val="center"/>
+          </w:tcPr>
+          <w:p>
+            <w:pPr>
+              <w:bidi/>
+              <w:spacing w:after="40"/>
+              <w:jc w:val="start"/>
+            </w:pPr>
+            <w:r>
+              <w:rPr>
+                <w:rFonts w:ascii="David" w:cs="David" w:eastAsia="David" w:hAnsi="David"/>
+                <w:sz w:val="20"/>
+                <w:szCs w:val="20"/>
+                <w:rtl/>
+              </w:rPr>
               <w:t xml:space="preserve">יודע לתרגם בין סיפור חשבוני, תרגיל אלגברי והמחשה</w:t>
             </w:r>
           </w:p>
@@ -15548,6 +16174,238 @@
                 <w:szCs w:val="20"/>
                 <w:rtl/>
               </w:rPr>
+              <w:t xml:space="preserve">פותר תרגילי חיסור בתחום ה-1000 ומעלה ללא פריטה ועם פריטה</w:t>
+            </w:r>
+          </w:p>
+        </w:tc>
+        <w:tc>
+          <w:tcPr>
+            <w:tcW w:type="dxa" w:w="1030"/>
+            <w:tcMar>
+              <w:top w:type="dxa" w:w="60"/>
+              <w:left w:type="dxa" w:w="90"/>
+              <w:bottom w:type="dxa" w:w="60"/>
+              <w:right w:type="dxa" w:w="90"/>
+            </w:tcMar>
+            <w:vAlign w:val="center"/>
+          </w:tcPr>
+          <w:p>
+            <w:pPr>
+              <w:bidi/>
+              <w:spacing w:after="40"/>
+              <w:jc w:val="center"/>
+            </w:pPr>
+            <w:r>
+              <w:rPr>
+                <w:rFonts w:ascii="David" w:cs="David" w:eastAsia="David" w:hAnsi="David"/>
+                <w:b/>
+                <w:bCs/>
+                <w:sz w:val="20"/>
+                <w:szCs w:val="20"/>
+                <w:rtl/>
+              </w:rPr>
+              <w:t xml:space="preserve">טרם נלמד</w:t>
+            </w:r>
+          </w:p>
+        </w:tc>
+        <w:tc>
+          <w:tcPr>
+            <w:tcW w:type="dxa" w:w="1030"/>
+            <w:tcMar>
+              <w:top w:type="dxa" w:w="60"/>
+              <w:left w:type="dxa" w:w="90"/>
+              <w:bottom w:type="dxa" w:w="60"/>
+              <w:right w:type="dxa" w:w="90"/>
+            </w:tcMar>
+            <w:vAlign w:val="center"/>
+          </w:tcPr>
+          <w:p>
+            <w:pPr>
+              <w:bidi/>
+              <w:spacing w:after="40"/>
+              <w:jc w:val="start"/>
+            </w:pPr>
+            <w:r>
+              <w:rPr>
+                <w:rFonts w:ascii="David" w:cs="David" w:eastAsia="David" w:hAnsi="David"/>
+                <w:sz w:val="20"/>
+                <w:szCs w:val="20"/>
+                <w:rtl/>
+              </w:rPr>
+              <w:t xml:space="preserve"/>
+            </w:r>
+          </w:p>
+        </w:tc>
+        <w:tc>
+          <w:tcPr>
+            <w:tcW w:type="dxa" w:w="1040"/>
+            <w:tcMar>
+              <w:top w:type="dxa" w:w="60"/>
+              <w:left w:type="dxa" w:w="90"/>
+              <w:bottom w:type="dxa" w:w="60"/>
+              <w:right w:type="dxa" w:w="90"/>
+            </w:tcMar>
+            <w:vAlign w:val="center"/>
+          </w:tcPr>
+          <w:p>
+            <w:pPr>
+              <w:bidi/>
+              <w:spacing w:after="40"/>
+              <w:jc w:val="start"/>
+            </w:pPr>
+            <w:r>
+              <w:rPr>
+                <w:rFonts w:ascii="David" w:cs="David" w:eastAsia="David" w:hAnsi="David"/>
+                <w:sz w:val="20"/>
+                <w:szCs w:val="20"/>
+                <w:rtl/>
+              </w:rPr>
+              <w:t xml:space="preserve"/>
+            </w:r>
+          </w:p>
+        </w:tc>
+      </w:tr>
+      <w:tr>
+        <w:tc>
+          <w:tcPr>
+            <w:tcW w:type="dxa" w:w="6160"/>
+            <w:tcMar>
+              <w:top w:type="dxa" w:w="60"/>
+              <w:left w:type="dxa" w:w="90"/>
+              <w:bottom w:type="dxa" w:w="60"/>
+              <w:right w:type="dxa" w:w="90"/>
+            </w:tcMar>
+            <w:vAlign w:val="center"/>
+          </w:tcPr>
+          <w:p>
+            <w:pPr>
+              <w:bidi/>
+              <w:spacing w:after="40"/>
+              <w:jc w:val="start"/>
+            </w:pPr>
+            <w:r>
+              <w:rPr>
+                <w:rFonts w:ascii="David" w:cs="David" w:eastAsia="David" w:hAnsi="David"/>
+                <w:sz w:val="20"/>
+                <w:szCs w:val="20"/>
+                <w:rtl/>
+              </w:rPr>
+              <w:t xml:space="preserve">יודע לבצע פרוצדורות (חישובים) בהתאם לתוכנית הלימודים: חיסור במאונך ובמאוזן בתחום ה-100</w:t>
+            </w:r>
+          </w:p>
+        </w:tc>
+        <w:tc>
+          <w:tcPr>
+            <w:tcW w:type="dxa" w:w="1030"/>
+            <w:tcMar>
+              <w:top w:type="dxa" w:w="60"/>
+              <w:left w:type="dxa" w:w="90"/>
+              <w:bottom w:type="dxa" w:w="60"/>
+              <w:right w:type="dxa" w:w="90"/>
+            </w:tcMar>
+            <w:vAlign w:val="center"/>
+          </w:tcPr>
+          <w:p>
+            <w:pPr>
+              <w:bidi/>
+              <w:spacing w:after="40"/>
+              <w:jc w:val="center"/>
+            </w:pPr>
+            <w:r>
+              <w:rPr>
+                <w:rFonts w:ascii="David" w:cs="David" w:eastAsia="David" w:hAnsi="David"/>
+                <w:b/>
+                <w:bCs/>
+                <w:sz w:val="20"/>
+                <w:szCs w:val="20"/>
+                <w:rtl/>
+              </w:rPr>
+              <w:t xml:space="preserve">2</w:t>
+            </w:r>
+          </w:p>
+        </w:tc>
+        <w:tc>
+          <w:tcPr>
+            <w:tcW w:type="dxa" w:w="1030"/>
+            <w:tcMar>
+              <w:top w:type="dxa" w:w="60"/>
+              <w:left w:type="dxa" w:w="90"/>
+              <w:bottom w:type="dxa" w:w="60"/>
+              <w:right w:type="dxa" w:w="90"/>
+            </w:tcMar>
+            <w:vAlign w:val="center"/>
+          </w:tcPr>
+          <w:p>
+            <w:pPr>
+              <w:bidi/>
+              <w:spacing w:after="40"/>
+              <w:jc w:val="start"/>
+            </w:pPr>
+            <w:r>
+              <w:rPr>
+                <w:rFonts w:ascii="David" w:cs="David" w:eastAsia="David" w:hAnsi="David"/>
+                <w:sz w:val="20"/>
+                <w:szCs w:val="20"/>
+                <w:rtl/>
+              </w:rPr>
+              <w:t xml:space="preserve"/>
+            </w:r>
+          </w:p>
+        </w:tc>
+        <w:tc>
+          <w:tcPr>
+            <w:tcW w:type="dxa" w:w="1040"/>
+            <w:tcMar>
+              <w:top w:type="dxa" w:w="60"/>
+              <w:left w:type="dxa" w:w="90"/>
+              <w:bottom w:type="dxa" w:w="60"/>
+              <w:right w:type="dxa" w:w="90"/>
+            </w:tcMar>
+            <w:vAlign w:val="center"/>
+          </w:tcPr>
+          <w:p>
+            <w:pPr>
+              <w:bidi/>
+              <w:spacing w:after="40"/>
+              <w:jc w:val="start"/>
+            </w:pPr>
+            <w:r>
+              <w:rPr>
+                <w:rFonts w:ascii="David" w:cs="David" w:eastAsia="David" w:hAnsi="David"/>
+                <w:sz w:val="20"/>
+                <w:szCs w:val="20"/>
+                <w:rtl/>
+              </w:rPr>
+              <w:t xml:space="preserve"/>
+            </w:r>
+          </w:p>
+        </w:tc>
+      </w:tr>
+      <w:tr>
+        <w:tc>
+          <w:tcPr>
+            <w:tcW w:type="dxa" w:w="6160"/>
+            <w:tcMar>
+              <w:top w:type="dxa" w:w="60"/>
+              <w:left w:type="dxa" w:w="90"/>
+              <w:bottom w:type="dxa" w:w="60"/>
+              <w:right w:type="dxa" w:w="90"/>
+            </w:tcMar>
+            <w:vAlign w:val="center"/>
+          </w:tcPr>
+          <w:p>
+            <w:pPr>
+              <w:bidi/>
+              <w:spacing w:after="40"/>
+              <w:jc w:val="start"/>
+            </w:pPr>
+            <w:r>
+              <w:rPr>
+                <w:rFonts w:ascii="David" w:cs="David" w:eastAsia="David" w:hAnsi="David"/>
+                <w:sz w:val="20"/>
+                <w:szCs w:val="20"/>
+                <w:rtl/>
+              </w:rPr>
               <w:t xml:space="preserve">יודע לתרגם בין סיפור חשבוני, תרגיל אלגברי והמחשה</w:t>
             </w:r>
           </w:p>
@@ -16133,7 +16991,7 @@
                 <w:szCs w:val="20"/>
                 <w:rtl/>
               </w:rPr>
-              <w:t xml:space="preserve">פעולות הכפל והחילוק (בתחילת רכישה, בהתאם לשלב בכיתה ג')</w:t>
+              <w:t xml:space="preserve">פעולת הכפל (בתחילת רכישה, בהתאם לשלב בכיתה ג')</w:t>
             </w:r>
           </w:p>
         </w:tc>
@@ -16163,7 +17021,7 @@
                 <w:szCs w:val="20"/>
                 <w:rtl/>
               </w:rPr>
-              <w:t xml:space="preserve">מבין את מהות הכפל ואת הקשר לחיבור חוזר (שפת הקבוצות)</w:t>
+              <w:t xml:space="preserve">מבין את משמעות הסימן ואת מהות הפעולה</w:t>
             </w:r>
           </w:p>
         </w:tc>
@@ -16279,7 +17137,7 @@
                 <w:szCs w:val="20"/>
                 <w:rtl/>
               </w:rPr>
-              <w:t xml:space="preserve">מכיר את מושגי הכפל (מכפלה, גורמים, פעמים)</w:t>
+              <w:t xml:space="preserve">מבין את הקשר בין פעולת הכפל לבין חיבור חוזר (שפת הקבוצות)</w:t>
             </w:r>
           </w:p>
         </w:tc>
@@ -16309,7 +17167,7 @@
                 <w:szCs w:val="20"/>
                 <w:rtl/>
               </w:rPr>
-              <w:t xml:space="preserve">2</w:t>
+              <w:t xml:space="preserve">3</w:t>
             </w:r>
           </w:p>
         </w:tc>
@@ -16395,7 +17253,7 @@
                 <w:szCs w:val="20"/>
                 <w:rtl/>
               </w:rPr>
-              <w:t xml:space="preserve">שולף עובדות כפל עד 20 (כפל ב-2, ב-5, ב-10)</w:t>
+              <w:t xml:space="preserve">מכיר את המושגים (מכפלה, גורמים, נכפל, כופל, פי, פעמים)</w:t>
             </w:r>
           </w:p>
         </w:tc>
@@ -16511,7 +17369,7 @@
                 <w:szCs w:val="20"/>
                 <w:rtl/>
               </w:rPr>
-              <w:t xml:space="preserve">מבין את מהות החילוק (להכלה ולחלקים) בעזרת אמצעים מוחשיים</w:t>
+              <w:t xml:space="preserve">מכיר את התכונות (כולל האפס והאחד)</w:t>
             </w:r>
           </w:p>
         </w:tc>
@@ -16627,7 +17485,7 @@
                 <w:szCs w:val="20"/>
                 <w:rtl/>
               </w:rPr>
-              <w:t xml:space="preserve">פותר שאלות מילוליות פשוטות בכפל</w:t>
+              <w:t xml:space="preserve">מכיר את החוקים (חוק החילוף, חוק הקיבוץ, חוק הפילוג)</w:t>
             </w:r>
           </w:p>
         </w:tc>
@@ -16657,7 +17515,1699 @@
                 <w:szCs w:val="20"/>
                 <w:rtl/>
               </w:rPr>
+              <w:t xml:space="preserve">טרם נלמד</w:t>
+            </w:r>
+          </w:p>
+        </w:tc>
+        <w:tc>
+          <w:tcPr>
+            <w:tcW w:type="dxa" w:w="1030"/>
+            <w:tcMar>
+              <w:top w:type="dxa" w:w="60"/>
+              <w:left w:type="dxa" w:w="90"/>
+              <w:bottom w:type="dxa" w:w="60"/>
+              <w:right w:type="dxa" w:w="90"/>
+            </w:tcMar>
+            <w:vAlign w:val="center"/>
+          </w:tcPr>
+          <w:p>
+            <w:pPr>
+              <w:bidi/>
+              <w:spacing w:after="40"/>
+              <w:jc w:val="start"/>
+            </w:pPr>
+            <w:r>
+              <w:rPr>
+                <w:rFonts w:ascii="David" w:cs="David" w:eastAsia="David" w:hAnsi="David"/>
+                <w:sz w:val="20"/>
+                <w:szCs w:val="20"/>
+                <w:rtl/>
+              </w:rPr>
+              <w:t xml:space="preserve"/>
+            </w:r>
+          </w:p>
+        </w:tc>
+        <w:tc>
+          <w:tcPr>
+            <w:tcW w:type="dxa" w:w="1040"/>
+            <w:tcMar>
+              <w:top w:type="dxa" w:w="60"/>
+              <w:left w:type="dxa" w:w="90"/>
+              <w:bottom w:type="dxa" w:w="60"/>
+              <w:right w:type="dxa" w:w="90"/>
+            </w:tcMar>
+            <w:vAlign w:val="center"/>
+          </w:tcPr>
+          <w:p>
+            <w:pPr>
+              <w:bidi/>
+              <w:spacing w:after="40"/>
+              <w:jc w:val="start"/>
+            </w:pPr>
+            <w:r>
+              <w:rPr>
+                <w:rFonts w:ascii="David" w:cs="David" w:eastAsia="David" w:hAnsi="David"/>
+                <w:sz w:val="20"/>
+                <w:szCs w:val="20"/>
+                <w:rtl/>
+              </w:rPr>
+              <w:t xml:space="preserve"/>
+            </w:r>
+          </w:p>
+        </w:tc>
+      </w:tr>
+      <w:tr>
+        <w:tc>
+          <w:tcPr>
+            <w:tcW w:type="dxa" w:w="6160"/>
+            <w:tcMar>
+              <w:top w:type="dxa" w:w="60"/>
+              <w:left w:type="dxa" w:w="90"/>
+              <w:bottom w:type="dxa" w:w="60"/>
+              <w:right w:type="dxa" w:w="90"/>
+            </w:tcMar>
+            <w:vAlign w:val="center"/>
+          </w:tcPr>
+          <w:p>
+            <w:pPr>
+              <w:bidi/>
+              <w:spacing w:after="40"/>
+              <w:jc w:val="start"/>
+            </w:pPr>
+            <w:r>
+              <w:rPr>
+                <w:rFonts w:ascii="David" w:cs="David" w:eastAsia="David" w:hAnsi="David"/>
+                <w:sz w:val="20"/>
+                <w:szCs w:val="20"/>
+                <w:rtl/>
+              </w:rPr>
+              <w:t xml:space="preserve">שולף עובדות כפל עד 20 (כפל ב-2, ב-5, ב-10)</w:t>
+            </w:r>
+          </w:p>
+        </w:tc>
+        <w:tc>
+          <w:tcPr>
+            <w:tcW w:type="dxa" w:w="1030"/>
+            <w:tcMar>
+              <w:top w:type="dxa" w:w="60"/>
+              <w:left w:type="dxa" w:w="90"/>
+              <w:bottom w:type="dxa" w:w="60"/>
+              <w:right w:type="dxa" w:w="90"/>
+            </w:tcMar>
+            <w:vAlign w:val="center"/>
+          </w:tcPr>
+          <w:p>
+            <w:pPr>
+              <w:bidi/>
+              <w:spacing w:after="40"/>
+              <w:jc w:val="center"/>
+            </w:pPr>
+            <w:r>
+              <w:rPr>
+                <w:rFonts w:ascii="David" w:cs="David" w:eastAsia="David" w:hAnsi="David"/>
+                <w:b/>
+                <w:bCs/>
+                <w:sz w:val="20"/>
+                <w:szCs w:val="20"/>
+                <w:rtl/>
+              </w:rPr>
               <w:t xml:space="preserve">2</w:t>
+            </w:r>
+          </w:p>
+        </w:tc>
+        <w:tc>
+          <w:tcPr>
+            <w:tcW w:type="dxa" w:w="1030"/>
+            <w:tcMar>
+              <w:top w:type="dxa" w:w="60"/>
+              <w:left w:type="dxa" w:w="90"/>
+              <w:bottom w:type="dxa" w:w="60"/>
+              <w:right w:type="dxa" w:w="90"/>
+            </w:tcMar>
+            <w:vAlign w:val="center"/>
+          </w:tcPr>
+          <w:p>
+            <w:pPr>
+              <w:bidi/>
+              <w:spacing w:after="40"/>
+              <w:jc w:val="start"/>
+            </w:pPr>
+            <w:r>
+              <w:rPr>
+                <w:rFonts w:ascii="David" w:cs="David" w:eastAsia="David" w:hAnsi="David"/>
+                <w:sz w:val="20"/>
+                <w:szCs w:val="20"/>
+                <w:rtl/>
+              </w:rPr>
+              <w:t xml:space="preserve"/>
+            </w:r>
+          </w:p>
+        </w:tc>
+        <w:tc>
+          <w:tcPr>
+            <w:tcW w:type="dxa" w:w="1040"/>
+            <w:tcMar>
+              <w:top w:type="dxa" w:w="60"/>
+              <w:left w:type="dxa" w:w="90"/>
+              <w:bottom w:type="dxa" w:w="60"/>
+              <w:right w:type="dxa" w:w="90"/>
+            </w:tcMar>
+            <w:vAlign w:val="center"/>
+          </w:tcPr>
+          <w:p>
+            <w:pPr>
+              <w:bidi/>
+              <w:spacing w:after="40"/>
+              <w:jc w:val="start"/>
+            </w:pPr>
+            <w:r>
+              <w:rPr>
+                <w:rFonts w:ascii="David" w:cs="David" w:eastAsia="David" w:hAnsi="David"/>
+                <w:sz w:val="20"/>
+                <w:szCs w:val="20"/>
+                <w:rtl/>
+              </w:rPr>
+              <w:t xml:space="preserve"/>
+            </w:r>
+          </w:p>
+        </w:tc>
+      </w:tr>
+      <w:tr>
+        <w:tc>
+          <w:tcPr>
+            <w:tcW w:type="dxa" w:w="6160"/>
+            <w:tcMar>
+              <w:top w:type="dxa" w:w="60"/>
+              <w:left w:type="dxa" w:w="90"/>
+              <w:bottom w:type="dxa" w:w="60"/>
+              <w:right w:type="dxa" w:w="90"/>
+            </w:tcMar>
+            <w:vAlign w:val="center"/>
+          </w:tcPr>
+          <w:p>
+            <w:pPr>
+              <w:bidi/>
+              <w:spacing w:after="40"/>
+              <w:jc w:val="start"/>
+            </w:pPr>
+            <w:r>
+              <w:rPr>
+                <w:rFonts w:ascii="David" w:cs="David" w:eastAsia="David" w:hAnsi="David"/>
+                <w:sz w:val="20"/>
+                <w:szCs w:val="20"/>
+                <w:rtl/>
+              </w:rPr>
+              <w:t xml:space="preserve">שולף עובדות כפל עד 100</w:t>
+            </w:r>
+          </w:p>
+        </w:tc>
+        <w:tc>
+          <w:tcPr>
+            <w:tcW w:type="dxa" w:w="1030"/>
+            <w:tcMar>
+              <w:top w:type="dxa" w:w="60"/>
+              <w:left w:type="dxa" w:w="90"/>
+              <w:bottom w:type="dxa" w:w="60"/>
+              <w:right w:type="dxa" w:w="90"/>
+            </w:tcMar>
+            <w:vAlign w:val="center"/>
+          </w:tcPr>
+          <w:p>
+            <w:pPr>
+              <w:bidi/>
+              <w:spacing w:after="40"/>
+              <w:jc w:val="center"/>
+            </w:pPr>
+            <w:r>
+              <w:rPr>
+                <w:rFonts w:ascii="David" w:cs="David" w:eastAsia="David" w:hAnsi="David"/>
+                <w:b/>
+                <w:bCs/>
+                <w:sz w:val="20"/>
+                <w:szCs w:val="20"/>
+                <w:rtl/>
+              </w:rPr>
+              <w:t xml:space="preserve">טרם נלמד</w:t>
+            </w:r>
+          </w:p>
+        </w:tc>
+        <w:tc>
+          <w:tcPr>
+            <w:tcW w:type="dxa" w:w="1030"/>
+            <w:tcMar>
+              <w:top w:type="dxa" w:w="60"/>
+              <w:left w:type="dxa" w:w="90"/>
+              <w:bottom w:type="dxa" w:w="60"/>
+              <w:right w:type="dxa" w:w="90"/>
+            </w:tcMar>
+            <w:vAlign w:val="center"/>
+          </w:tcPr>
+          <w:p>
+            <w:pPr>
+              <w:bidi/>
+              <w:spacing w:after="40"/>
+              <w:jc w:val="start"/>
+            </w:pPr>
+            <w:r>
+              <w:rPr>
+                <w:rFonts w:ascii="David" w:cs="David" w:eastAsia="David" w:hAnsi="David"/>
+                <w:sz w:val="20"/>
+                <w:szCs w:val="20"/>
+                <w:rtl/>
+              </w:rPr>
+              <w:t xml:space="preserve"/>
+            </w:r>
+          </w:p>
+        </w:tc>
+        <w:tc>
+          <w:tcPr>
+            <w:tcW w:type="dxa" w:w="1040"/>
+            <w:tcMar>
+              <w:top w:type="dxa" w:w="60"/>
+              <w:left w:type="dxa" w:w="90"/>
+              <w:bottom w:type="dxa" w:w="60"/>
+              <w:right w:type="dxa" w:w="90"/>
+            </w:tcMar>
+            <w:vAlign w:val="center"/>
+          </w:tcPr>
+          <w:p>
+            <w:pPr>
+              <w:bidi/>
+              <w:spacing w:after="40"/>
+              <w:jc w:val="start"/>
+            </w:pPr>
+            <w:r>
+              <w:rPr>
+                <w:rFonts w:ascii="David" w:cs="David" w:eastAsia="David" w:hAnsi="David"/>
+                <w:sz w:val="20"/>
+                <w:szCs w:val="20"/>
+                <w:rtl/>
+              </w:rPr>
+              <w:t xml:space="preserve"/>
+            </w:r>
+          </w:p>
+        </w:tc>
+      </w:tr>
+      <w:tr>
+        <w:tc>
+          <w:tcPr>
+            <w:tcW w:type="dxa" w:w="6160"/>
+            <w:tcMar>
+              <w:top w:type="dxa" w:w="60"/>
+              <w:left w:type="dxa" w:w="90"/>
+              <w:bottom w:type="dxa" w:w="60"/>
+              <w:right w:type="dxa" w:w="90"/>
+            </w:tcMar>
+            <w:vAlign w:val="center"/>
+          </w:tcPr>
+          <w:p>
+            <w:pPr>
+              <w:bidi/>
+              <w:spacing w:after="40"/>
+              <w:jc w:val="start"/>
+            </w:pPr>
+            <w:r>
+              <w:rPr>
+                <w:rFonts w:ascii="David" w:cs="David" w:eastAsia="David" w:hAnsi="David"/>
+                <w:sz w:val="20"/>
+                <w:szCs w:val="20"/>
+                <w:rtl/>
+              </w:rPr>
+              <w:t xml:space="preserve">מבין את מבנה הכפל: קבוצות, פריטים בכל קבוצה, פריטים בסך הכול</w:t>
+            </w:r>
+          </w:p>
+        </w:tc>
+        <w:tc>
+          <w:tcPr>
+            <w:tcW w:type="dxa" w:w="1030"/>
+            <w:tcMar>
+              <w:top w:type="dxa" w:w="60"/>
+              <w:left w:type="dxa" w:w="90"/>
+              <w:bottom w:type="dxa" w:w="60"/>
+              <w:right w:type="dxa" w:w="90"/>
+            </w:tcMar>
+            <w:vAlign w:val="center"/>
+          </w:tcPr>
+          <w:p>
+            <w:pPr>
+              <w:bidi/>
+              <w:spacing w:after="40"/>
+              <w:jc w:val="center"/>
+            </w:pPr>
+            <w:r>
+              <w:rPr>
+                <w:rFonts w:ascii="David" w:cs="David" w:eastAsia="David" w:hAnsi="David"/>
+                <w:b/>
+                <w:bCs/>
+                <w:sz w:val="20"/>
+                <w:szCs w:val="20"/>
+                <w:rtl/>
+              </w:rPr>
+              <w:t xml:space="preserve">2</w:t>
+            </w:r>
+          </w:p>
+        </w:tc>
+        <w:tc>
+          <w:tcPr>
+            <w:tcW w:type="dxa" w:w="1030"/>
+            <w:tcMar>
+              <w:top w:type="dxa" w:w="60"/>
+              <w:left w:type="dxa" w:w="90"/>
+              <w:bottom w:type="dxa" w:w="60"/>
+              <w:right w:type="dxa" w:w="90"/>
+            </w:tcMar>
+            <w:vAlign w:val="center"/>
+          </w:tcPr>
+          <w:p>
+            <w:pPr>
+              <w:bidi/>
+              <w:spacing w:after="40"/>
+              <w:jc w:val="start"/>
+            </w:pPr>
+            <w:r>
+              <w:rPr>
+                <w:rFonts w:ascii="David" w:cs="David" w:eastAsia="David" w:hAnsi="David"/>
+                <w:sz w:val="20"/>
+                <w:szCs w:val="20"/>
+                <w:rtl/>
+              </w:rPr>
+              <w:t xml:space="preserve"/>
+            </w:r>
+          </w:p>
+        </w:tc>
+        <w:tc>
+          <w:tcPr>
+            <w:tcW w:type="dxa" w:w="1040"/>
+            <w:tcMar>
+              <w:top w:type="dxa" w:w="60"/>
+              <w:left w:type="dxa" w:w="90"/>
+              <w:bottom w:type="dxa" w:w="60"/>
+              <w:right w:type="dxa" w:w="90"/>
+            </w:tcMar>
+            <w:vAlign w:val="center"/>
+          </w:tcPr>
+          <w:p>
+            <w:pPr>
+              <w:bidi/>
+              <w:spacing w:after="40"/>
+              <w:jc w:val="start"/>
+            </w:pPr>
+            <w:r>
+              <w:rPr>
+                <w:rFonts w:ascii="David" w:cs="David" w:eastAsia="David" w:hAnsi="David"/>
+                <w:sz w:val="20"/>
+                <w:szCs w:val="20"/>
+                <w:rtl/>
+              </w:rPr>
+              <w:t xml:space="preserve"/>
+            </w:r>
+          </w:p>
+        </w:tc>
+      </w:tr>
+      <w:tr>
+        <w:tc>
+          <w:tcPr>
+            <w:tcW w:type="dxa" w:w="6160"/>
+            <w:tcMar>
+              <w:top w:type="dxa" w:w="60"/>
+              <w:left w:type="dxa" w:w="90"/>
+              <w:bottom w:type="dxa" w:w="60"/>
+              <w:right w:type="dxa" w:w="90"/>
+            </w:tcMar>
+            <w:vAlign w:val="center"/>
+          </w:tcPr>
+          <w:p>
+            <w:pPr>
+              <w:bidi/>
+              <w:spacing w:after="40"/>
+              <w:jc w:val="start"/>
+            </w:pPr>
+            <w:r>
+              <w:rPr>
+                <w:rFonts w:ascii="David" w:cs="David" w:eastAsia="David" w:hAnsi="David"/>
+                <w:sz w:val="20"/>
+                <w:szCs w:val="20"/>
+                <w:rtl/>
+              </w:rPr>
+              <w:t xml:space="preserve">יודע לתרגם בין סיפור חשבוני, תרגיל אלגברי והמחשה</w:t>
+            </w:r>
+          </w:p>
+        </w:tc>
+        <w:tc>
+          <w:tcPr>
+            <w:tcW w:type="dxa" w:w="1030"/>
+            <w:tcMar>
+              <w:top w:type="dxa" w:w="60"/>
+              <w:left w:type="dxa" w:w="90"/>
+              <w:bottom w:type="dxa" w:w="60"/>
+              <w:right w:type="dxa" w:w="90"/>
+            </w:tcMar>
+            <w:vAlign w:val="center"/>
+          </w:tcPr>
+          <w:p>
+            <w:pPr>
+              <w:bidi/>
+              <w:spacing w:after="40"/>
+              <w:jc w:val="center"/>
+            </w:pPr>
+            <w:r>
+              <w:rPr>
+                <w:rFonts w:ascii="David" w:cs="David" w:eastAsia="David" w:hAnsi="David"/>
+                <w:b/>
+                <w:bCs/>
+                <w:sz w:val="20"/>
+                <w:szCs w:val="20"/>
+                <w:rtl/>
+              </w:rPr>
+              <w:t xml:space="preserve">2</w:t>
+            </w:r>
+          </w:p>
+        </w:tc>
+        <w:tc>
+          <w:tcPr>
+            <w:tcW w:type="dxa" w:w="1030"/>
+            <w:tcMar>
+              <w:top w:type="dxa" w:w="60"/>
+              <w:left w:type="dxa" w:w="90"/>
+              <w:bottom w:type="dxa" w:w="60"/>
+              <w:right w:type="dxa" w:w="90"/>
+            </w:tcMar>
+            <w:vAlign w:val="center"/>
+          </w:tcPr>
+          <w:p>
+            <w:pPr>
+              <w:bidi/>
+              <w:spacing w:after="40"/>
+              <w:jc w:val="start"/>
+            </w:pPr>
+            <w:r>
+              <w:rPr>
+                <w:rFonts w:ascii="David" w:cs="David" w:eastAsia="David" w:hAnsi="David"/>
+                <w:sz w:val="20"/>
+                <w:szCs w:val="20"/>
+                <w:rtl/>
+              </w:rPr>
+              <w:t xml:space="preserve"/>
+            </w:r>
+          </w:p>
+        </w:tc>
+        <w:tc>
+          <w:tcPr>
+            <w:tcW w:type="dxa" w:w="1040"/>
+            <w:tcMar>
+              <w:top w:type="dxa" w:w="60"/>
+              <w:left w:type="dxa" w:w="90"/>
+              <w:bottom w:type="dxa" w:w="60"/>
+              <w:right w:type="dxa" w:w="90"/>
+            </w:tcMar>
+            <w:vAlign w:val="center"/>
+          </w:tcPr>
+          <w:p>
+            <w:pPr>
+              <w:bidi/>
+              <w:spacing w:after="40"/>
+              <w:jc w:val="start"/>
+            </w:pPr>
+            <w:r>
+              <w:rPr>
+                <w:rFonts w:ascii="David" w:cs="David" w:eastAsia="David" w:hAnsi="David"/>
+                <w:sz w:val="20"/>
+                <w:szCs w:val="20"/>
+                <w:rtl/>
+              </w:rPr>
+              <w:t xml:space="preserve"/>
+            </w:r>
+          </w:p>
+        </w:tc>
+      </w:tr>
+      <w:tr>
+        <w:tc>
+          <w:tcPr>
+            <w:tcW w:type="dxa" w:w="6160"/>
+            <w:tcMar>
+              <w:top w:type="dxa" w:w="60"/>
+              <w:left w:type="dxa" w:w="90"/>
+              <w:bottom w:type="dxa" w:w="60"/>
+              <w:right w:type="dxa" w:w="90"/>
+            </w:tcMar>
+            <w:vAlign w:val="center"/>
+          </w:tcPr>
+          <w:p>
+            <w:pPr>
+              <w:bidi/>
+              <w:spacing w:after="40"/>
+              <w:jc w:val="start"/>
+            </w:pPr>
+            <w:r>
+              <w:rPr>
+                <w:rFonts w:ascii="David" w:cs="David" w:eastAsia="David" w:hAnsi="David"/>
+                <w:sz w:val="20"/>
+                <w:szCs w:val="20"/>
+                <w:rtl/>
+              </w:rPr>
+              <w:t xml:space="preserve">פותר שאלות מילוליות פשוטות בכפל</w:t>
+            </w:r>
+          </w:p>
+        </w:tc>
+        <w:tc>
+          <w:tcPr>
+            <w:tcW w:type="dxa" w:w="1030"/>
+            <w:tcMar>
+              <w:top w:type="dxa" w:w="60"/>
+              <w:left w:type="dxa" w:w="90"/>
+              <w:bottom w:type="dxa" w:w="60"/>
+              <w:right w:type="dxa" w:w="90"/>
+            </w:tcMar>
+            <w:vAlign w:val="center"/>
+          </w:tcPr>
+          <w:p>
+            <w:pPr>
+              <w:bidi/>
+              <w:spacing w:after="40"/>
+              <w:jc w:val="center"/>
+            </w:pPr>
+            <w:r>
+              <w:rPr>
+                <w:rFonts w:ascii="David" w:cs="David" w:eastAsia="David" w:hAnsi="David"/>
+                <w:b/>
+                <w:bCs/>
+                <w:sz w:val="20"/>
+                <w:szCs w:val="20"/>
+                <w:rtl/>
+              </w:rPr>
+              <w:t xml:space="preserve">2</w:t>
+            </w:r>
+          </w:p>
+        </w:tc>
+        <w:tc>
+          <w:tcPr>
+            <w:tcW w:type="dxa" w:w="1030"/>
+            <w:tcMar>
+              <w:top w:type="dxa" w:w="60"/>
+              <w:left w:type="dxa" w:w="90"/>
+              <w:bottom w:type="dxa" w:w="60"/>
+              <w:right w:type="dxa" w:w="90"/>
+            </w:tcMar>
+            <w:vAlign w:val="center"/>
+          </w:tcPr>
+          <w:p>
+            <w:pPr>
+              <w:bidi/>
+              <w:spacing w:after="40"/>
+              <w:jc w:val="start"/>
+            </w:pPr>
+            <w:r>
+              <w:rPr>
+                <w:rFonts w:ascii="David" w:cs="David" w:eastAsia="David" w:hAnsi="David"/>
+                <w:sz w:val="20"/>
+                <w:szCs w:val="20"/>
+                <w:rtl/>
+              </w:rPr>
+              <w:t xml:space="preserve"/>
+            </w:r>
+          </w:p>
+        </w:tc>
+        <w:tc>
+          <w:tcPr>
+            <w:tcW w:type="dxa" w:w="1040"/>
+            <w:tcMar>
+              <w:top w:type="dxa" w:w="60"/>
+              <w:left w:type="dxa" w:w="90"/>
+              <w:bottom w:type="dxa" w:w="60"/>
+              <w:right w:type="dxa" w:w="90"/>
+            </w:tcMar>
+            <w:vAlign w:val="center"/>
+          </w:tcPr>
+          <w:p>
+            <w:pPr>
+              <w:bidi/>
+              <w:spacing w:after="40"/>
+              <w:jc w:val="start"/>
+            </w:pPr>
+            <w:r>
+              <w:rPr>
+                <w:rFonts w:ascii="David" w:cs="David" w:eastAsia="David" w:hAnsi="David"/>
+                <w:sz w:val="20"/>
+                <w:szCs w:val="20"/>
+                <w:rtl/>
+              </w:rPr>
+              <w:t xml:space="preserve"/>
+            </w:r>
+          </w:p>
+        </w:tc>
+      </w:tr>
+      <w:tr>
+        <w:tc>
+          <w:tcPr>
+            <w:tcW w:type="dxa" w:w="9260"/>
+            <w:gridSpan w:val="4"/>
+            <w:shd w:fill="EDEDED" w:color="auto" w:val="clear"/>
+            <w:tcMar>
+              <w:top w:type="dxa" w:w="60"/>
+              <w:left w:type="dxa" w:w="90"/>
+              <w:bottom w:type="dxa" w:w="60"/>
+              <w:right w:type="dxa" w:w="90"/>
+            </w:tcMar>
+            <w:vAlign w:val="center"/>
+          </w:tcPr>
+          <w:p>
+            <w:pPr>
+              <w:bidi/>
+              <w:spacing w:after="40"/>
+              <w:jc w:val="start"/>
+            </w:pPr>
+            <w:r>
+              <w:rPr>
+                <w:rFonts w:ascii="David" w:cs="David" w:eastAsia="David" w:hAnsi="David"/>
+                <w:b/>
+                <w:bCs/>
+                <w:sz w:val="20"/>
+                <w:szCs w:val="20"/>
+                <w:rtl/>
+              </w:rPr>
+              <w:t xml:space="preserve">פעולת החילוק (בתחילת רכישה, בהתאם לשלב בכיתה ג')</w:t>
+            </w:r>
+          </w:p>
+        </w:tc>
+      </w:tr>
+      <w:tr>
+        <w:tc>
+          <w:tcPr>
+            <w:tcW w:type="dxa" w:w="6160"/>
+            <w:tcMar>
+              <w:top w:type="dxa" w:w="60"/>
+              <w:left w:type="dxa" w:w="90"/>
+              <w:bottom w:type="dxa" w:w="60"/>
+              <w:right w:type="dxa" w:w="90"/>
+            </w:tcMar>
+            <w:vAlign w:val="center"/>
+          </w:tcPr>
+          <w:p>
+            <w:pPr>
+              <w:bidi/>
+              <w:spacing w:after="40"/>
+              <w:jc w:val="start"/>
+            </w:pPr>
+            <w:r>
+              <w:rPr>
+                <w:rFonts w:ascii="David" w:cs="David" w:eastAsia="David" w:hAnsi="David"/>
+                <w:sz w:val="20"/>
+                <w:szCs w:val="20"/>
+                <w:rtl/>
+              </w:rPr>
+              <w:t xml:space="preserve">מבין את משמעות הסימן ואת מהות הפעולה</w:t>
+            </w:r>
+          </w:p>
+        </w:tc>
+        <w:tc>
+          <w:tcPr>
+            <w:tcW w:type="dxa" w:w="1030"/>
+            <w:tcMar>
+              <w:top w:type="dxa" w:w="60"/>
+              <w:left w:type="dxa" w:w="90"/>
+              <w:bottom w:type="dxa" w:w="60"/>
+              <w:right w:type="dxa" w:w="90"/>
+            </w:tcMar>
+            <w:vAlign w:val="center"/>
+          </w:tcPr>
+          <w:p>
+            <w:pPr>
+              <w:bidi/>
+              <w:spacing w:after="40"/>
+              <w:jc w:val="center"/>
+            </w:pPr>
+            <w:r>
+              <w:rPr>
+                <w:rFonts w:ascii="David" w:cs="David" w:eastAsia="David" w:hAnsi="David"/>
+                <w:b/>
+                <w:bCs/>
+                <w:sz w:val="20"/>
+                <w:szCs w:val="20"/>
+                <w:rtl/>
+              </w:rPr>
+              <w:t xml:space="preserve">2</w:t>
+            </w:r>
+          </w:p>
+        </w:tc>
+        <w:tc>
+          <w:tcPr>
+            <w:tcW w:type="dxa" w:w="1030"/>
+            <w:tcMar>
+              <w:top w:type="dxa" w:w="60"/>
+              <w:left w:type="dxa" w:w="90"/>
+              <w:bottom w:type="dxa" w:w="60"/>
+              <w:right w:type="dxa" w:w="90"/>
+            </w:tcMar>
+            <w:vAlign w:val="center"/>
+          </w:tcPr>
+          <w:p>
+            <w:pPr>
+              <w:bidi/>
+              <w:spacing w:after="40"/>
+              <w:jc w:val="start"/>
+            </w:pPr>
+            <w:r>
+              <w:rPr>
+                <w:rFonts w:ascii="David" w:cs="David" w:eastAsia="David" w:hAnsi="David"/>
+                <w:sz w:val="20"/>
+                <w:szCs w:val="20"/>
+                <w:rtl/>
+              </w:rPr>
+              <w:t xml:space="preserve"/>
+            </w:r>
+          </w:p>
+        </w:tc>
+        <w:tc>
+          <w:tcPr>
+            <w:tcW w:type="dxa" w:w="1040"/>
+            <w:tcMar>
+              <w:top w:type="dxa" w:w="60"/>
+              <w:left w:type="dxa" w:w="90"/>
+              <w:bottom w:type="dxa" w:w="60"/>
+              <w:right w:type="dxa" w:w="90"/>
+            </w:tcMar>
+            <w:vAlign w:val="center"/>
+          </w:tcPr>
+          <w:p>
+            <w:pPr>
+              <w:bidi/>
+              <w:spacing w:after="40"/>
+              <w:jc w:val="start"/>
+            </w:pPr>
+            <w:r>
+              <w:rPr>
+                <w:rFonts w:ascii="David" w:cs="David" w:eastAsia="David" w:hAnsi="David"/>
+                <w:sz w:val="20"/>
+                <w:szCs w:val="20"/>
+                <w:rtl/>
+              </w:rPr>
+              <w:t xml:space="preserve"/>
+            </w:r>
+          </w:p>
+        </w:tc>
+      </w:tr>
+      <w:tr>
+        <w:tc>
+          <w:tcPr>
+            <w:tcW w:type="dxa" w:w="6160"/>
+            <w:tcMar>
+              <w:top w:type="dxa" w:w="60"/>
+              <w:left w:type="dxa" w:w="90"/>
+              <w:bottom w:type="dxa" w:w="60"/>
+              <w:right w:type="dxa" w:w="90"/>
+            </w:tcMar>
+            <w:vAlign w:val="center"/>
+          </w:tcPr>
+          <w:p>
+            <w:pPr>
+              <w:bidi/>
+              <w:spacing w:after="40"/>
+              <w:jc w:val="start"/>
+            </w:pPr>
+            <w:r>
+              <w:rPr>
+                <w:rFonts w:ascii="David" w:cs="David" w:eastAsia="David" w:hAnsi="David"/>
+                <w:sz w:val="20"/>
+                <w:szCs w:val="20"/>
+                <w:rtl/>
+              </w:rPr>
+              <w:t xml:space="preserve">מבין את מהות החילוק להכלה בעזרת אמצעים מוחשיים</w:t>
+            </w:r>
+          </w:p>
+        </w:tc>
+        <w:tc>
+          <w:tcPr>
+            <w:tcW w:type="dxa" w:w="1030"/>
+            <w:tcMar>
+              <w:top w:type="dxa" w:w="60"/>
+              <w:left w:type="dxa" w:w="90"/>
+              <w:bottom w:type="dxa" w:w="60"/>
+              <w:right w:type="dxa" w:w="90"/>
+            </w:tcMar>
+            <w:vAlign w:val="center"/>
+          </w:tcPr>
+          <w:p>
+            <w:pPr>
+              <w:bidi/>
+              <w:spacing w:after="40"/>
+              <w:jc w:val="center"/>
+            </w:pPr>
+            <w:r>
+              <w:rPr>
+                <w:rFonts w:ascii="David" w:cs="David" w:eastAsia="David" w:hAnsi="David"/>
+                <w:b/>
+                <w:bCs/>
+                <w:sz w:val="20"/>
+                <w:szCs w:val="20"/>
+                <w:rtl/>
+              </w:rPr>
+              <w:t xml:space="preserve">2</w:t>
+            </w:r>
+          </w:p>
+        </w:tc>
+        <w:tc>
+          <w:tcPr>
+            <w:tcW w:type="dxa" w:w="1030"/>
+            <w:tcMar>
+              <w:top w:type="dxa" w:w="60"/>
+              <w:left w:type="dxa" w:w="90"/>
+              <w:bottom w:type="dxa" w:w="60"/>
+              <w:right w:type="dxa" w:w="90"/>
+            </w:tcMar>
+            <w:vAlign w:val="center"/>
+          </w:tcPr>
+          <w:p>
+            <w:pPr>
+              <w:bidi/>
+              <w:spacing w:after="40"/>
+              <w:jc w:val="start"/>
+            </w:pPr>
+            <w:r>
+              <w:rPr>
+                <w:rFonts w:ascii="David" w:cs="David" w:eastAsia="David" w:hAnsi="David"/>
+                <w:sz w:val="20"/>
+                <w:szCs w:val="20"/>
+                <w:rtl/>
+              </w:rPr>
+              <w:t xml:space="preserve"/>
+            </w:r>
+          </w:p>
+        </w:tc>
+        <w:tc>
+          <w:tcPr>
+            <w:tcW w:type="dxa" w:w="1040"/>
+            <w:tcMar>
+              <w:top w:type="dxa" w:w="60"/>
+              <w:left w:type="dxa" w:w="90"/>
+              <w:bottom w:type="dxa" w:w="60"/>
+              <w:right w:type="dxa" w:w="90"/>
+            </w:tcMar>
+            <w:vAlign w:val="center"/>
+          </w:tcPr>
+          <w:p>
+            <w:pPr>
+              <w:bidi/>
+              <w:spacing w:after="40"/>
+              <w:jc w:val="start"/>
+            </w:pPr>
+            <w:r>
+              <w:rPr>
+                <w:rFonts w:ascii="David" w:cs="David" w:eastAsia="David" w:hAnsi="David"/>
+                <w:sz w:val="20"/>
+                <w:szCs w:val="20"/>
+                <w:rtl/>
+              </w:rPr>
+              <w:t xml:space="preserve"/>
+            </w:r>
+          </w:p>
+        </w:tc>
+      </w:tr>
+      <w:tr>
+        <w:tc>
+          <w:tcPr>
+            <w:tcW w:type="dxa" w:w="6160"/>
+            <w:tcMar>
+              <w:top w:type="dxa" w:w="60"/>
+              <w:left w:type="dxa" w:w="90"/>
+              <w:bottom w:type="dxa" w:w="60"/>
+              <w:right w:type="dxa" w:w="90"/>
+            </w:tcMar>
+            <w:vAlign w:val="center"/>
+          </w:tcPr>
+          <w:p>
+            <w:pPr>
+              <w:bidi/>
+              <w:spacing w:after="40"/>
+              <w:jc w:val="start"/>
+            </w:pPr>
+            <w:r>
+              <w:rPr>
+                <w:rFonts w:ascii="David" w:cs="David" w:eastAsia="David" w:hAnsi="David"/>
+                <w:sz w:val="20"/>
+                <w:szCs w:val="20"/>
+                <w:rtl/>
+              </w:rPr>
+              <w:t xml:space="preserve">מבין את מהות החילוק לחלקים בעזרת אמצעים מוחשיים</w:t>
+            </w:r>
+          </w:p>
+        </w:tc>
+        <w:tc>
+          <w:tcPr>
+            <w:tcW w:type="dxa" w:w="1030"/>
+            <w:tcMar>
+              <w:top w:type="dxa" w:w="60"/>
+              <w:left w:type="dxa" w:w="90"/>
+              <w:bottom w:type="dxa" w:w="60"/>
+              <w:right w:type="dxa" w:w="90"/>
+            </w:tcMar>
+            <w:vAlign w:val="center"/>
+          </w:tcPr>
+          <w:p>
+            <w:pPr>
+              <w:bidi/>
+              <w:spacing w:after="40"/>
+              <w:jc w:val="center"/>
+            </w:pPr>
+            <w:r>
+              <w:rPr>
+                <w:rFonts w:ascii="David" w:cs="David" w:eastAsia="David" w:hAnsi="David"/>
+                <w:b/>
+                <w:bCs/>
+                <w:sz w:val="20"/>
+                <w:szCs w:val="20"/>
+                <w:rtl/>
+              </w:rPr>
+              <w:t xml:space="preserve">2</w:t>
+            </w:r>
+          </w:p>
+        </w:tc>
+        <w:tc>
+          <w:tcPr>
+            <w:tcW w:type="dxa" w:w="1030"/>
+            <w:tcMar>
+              <w:top w:type="dxa" w:w="60"/>
+              <w:left w:type="dxa" w:w="90"/>
+              <w:bottom w:type="dxa" w:w="60"/>
+              <w:right w:type="dxa" w:w="90"/>
+            </w:tcMar>
+            <w:vAlign w:val="center"/>
+          </w:tcPr>
+          <w:p>
+            <w:pPr>
+              <w:bidi/>
+              <w:spacing w:after="40"/>
+              <w:jc w:val="start"/>
+            </w:pPr>
+            <w:r>
+              <w:rPr>
+                <w:rFonts w:ascii="David" w:cs="David" w:eastAsia="David" w:hAnsi="David"/>
+                <w:sz w:val="20"/>
+                <w:szCs w:val="20"/>
+                <w:rtl/>
+              </w:rPr>
+              <w:t xml:space="preserve"/>
+            </w:r>
+          </w:p>
+        </w:tc>
+        <w:tc>
+          <w:tcPr>
+            <w:tcW w:type="dxa" w:w="1040"/>
+            <w:tcMar>
+              <w:top w:type="dxa" w:w="60"/>
+              <w:left w:type="dxa" w:w="90"/>
+              <w:bottom w:type="dxa" w:w="60"/>
+              <w:right w:type="dxa" w:w="90"/>
+            </w:tcMar>
+            <w:vAlign w:val="center"/>
+          </w:tcPr>
+          <w:p>
+            <w:pPr>
+              <w:bidi/>
+              <w:spacing w:after="40"/>
+              <w:jc w:val="start"/>
+            </w:pPr>
+            <w:r>
+              <w:rPr>
+                <w:rFonts w:ascii="David" w:cs="David" w:eastAsia="David" w:hAnsi="David"/>
+                <w:sz w:val="20"/>
+                <w:szCs w:val="20"/>
+                <w:rtl/>
+              </w:rPr>
+              <w:t xml:space="preserve"/>
+            </w:r>
+          </w:p>
+        </w:tc>
+      </w:tr>
+      <w:tr>
+        <w:tc>
+          <w:tcPr>
+            <w:tcW w:type="dxa" w:w="6160"/>
+            <w:tcMar>
+              <w:top w:type="dxa" w:w="60"/>
+              <w:left w:type="dxa" w:w="90"/>
+              <w:bottom w:type="dxa" w:w="60"/>
+              <w:right w:type="dxa" w:w="90"/>
+            </w:tcMar>
+            <w:vAlign w:val="center"/>
+          </w:tcPr>
+          <w:p>
+            <w:pPr>
+              <w:bidi/>
+              <w:spacing w:after="40"/>
+              <w:jc w:val="start"/>
+            </w:pPr>
+            <w:r>
+              <w:rPr>
+                <w:rFonts w:ascii="David" w:cs="David" w:eastAsia="David" w:hAnsi="David"/>
+                <w:sz w:val="20"/>
+                <w:szCs w:val="20"/>
+                <w:rtl/>
+              </w:rPr>
+              <w:t xml:space="preserve">מזהה שארית בפעולה מוחשית</w:t>
+            </w:r>
+          </w:p>
+        </w:tc>
+        <w:tc>
+          <w:tcPr>
+            <w:tcW w:type="dxa" w:w="1030"/>
+            <w:tcMar>
+              <w:top w:type="dxa" w:w="60"/>
+              <w:left w:type="dxa" w:w="90"/>
+              <w:bottom w:type="dxa" w:w="60"/>
+              <w:right w:type="dxa" w:w="90"/>
+            </w:tcMar>
+            <w:vAlign w:val="center"/>
+          </w:tcPr>
+          <w:p>
+            <w:pPr>
+              <w:bidi/>
+              <w:spacing w:after="40"/>
+              <w:jc w:val="center"/>
+            </w:pPr>
+            <w:r>
+              <w:rPr>
+                <w:rFonts w:ascii="David" w:cs="David" w:eastAsia="David" w:hAnsi="David"/>
+                <w:b/>
+                <w:bCs/>
+                <w:sz w:val="20"/>
+                <w:szCs w:val="20"/>
+                <w:rtl/>
+              </w:rPr>
+              <w:t xml:space="preserve">2</w:t>
+            </w:r>
+          </w:p>
+        </w:tc>
+        <w:tc>
+          <w:tcPr>
+            <w:tcW w:type="dxa" w:w="1030"/>
+            <w:tcMar>
+              <w:top w:type="dxa" w:w="60"/>
+              <w:left w:type="dxa" w:w="90"/>
+              <w:bottom w:type="dxa" w:w="60"/>
+              <w:right w:type="dxa" w:w="90"/>
+            </w:tcMar>
+            <w:vAlign w:val="center"/>
+          </w:tcPr>
+          <w:p>
+            <w:pPr>
+              <w:bidi/>
+              <w:spacing w:after="40"/>
+              <w:jc w:val="start"/>
+            </w:pPr>
+            <w:r>
+              <w:rPr>
+                <w:rFonts w:ascii="David" w:cs="David" w:eastAsia="David" w:hAnsi="David"/>
+                <w:sz w:val="20"/>
+                <w:szCs w:val="20"/>
+                <w:rtl/>
+              </w:rPr>
+              <w:t xml:space="preserve"/>
+            </w:r>
+          </w:p>
+        </w:tc>
+        <w:tc>
+          <w:tcPr>
+            <w:tcW w:type="dxa" w:w="1040"/>
+            <w:tcMar>
+              <w:top w:type="dxa" w:w="60"/>
+              <w:left w:type="dxa" w:w="90"/>
+              <w:bottom w:type="dxa" w:w="60"/>
+              <w:right w:type="dxa" w:w="90"/>
+            </w:tcMar>
+            <w:vAlign w:val="center"/>
+          </w:tcPr>
+          <w:p>
+            <w:pPr>
+              <w:bidi/>
+              <w:spacing w:after="40"/>
+              <w:jc w:val="start"/>
+            </w:pPr>
+            <w:r>
+              <w:rPr>
+                <w:rFonts w:ascii="David" w:cs="David" w:eastAsia="David" w:hAnsi="David"/>
+                <w:sz w:val="20"/>
+                <w:szCs w:val="20"/>
+                <w:rtl/>
+              </w:rPr>
+              <w:t xml:space="preserve"/>
+            </w:r>
+          </w:p>
+        </w:tc>
+      </w:tr>
+      <w:tr>
+        <w:tc>
+          <w:tcPr>
+            <w:tcW w:type="dxa" w:w="6160"/>
+            <w:tcMar>
+              <w:top w:type="dxa" w:w="60"/>
+              <w:left w:type="dxa" w:w="90"/>
+              <w:bottom w:type="dxa" w:w="60"/>
+              <w:right w:type="dxa" w:w="90"/>
+            </w:tcMar>
+            <w:vAlign w:val="center"/>
+          </w:tcPr>
+          <w:p>
+            <w:pPr>
+              <w:bidi/>
+              <w:spacing w:after="40"/>
+              <w:jc w:val="start"/>
+            </w:pPr>
+            <w:r>
+              <w:rPr>
+                <w:rFonts w:ascii="David" w:cs="David" w:eastAsia="David" w:hAnsi="David"/>
+                <w:sz w:val="20"/>
+                <w:szCs w:val="20"/>
+                <w:rtl/>
+              </w:rPr>
+              <w:t xml:space="preserve">מכיר את המושגים (מנה, חילוק לחלקים, חילוק להכלה)</w:t>
+            </w:r>
+          </w:p>
+        </w:tc>
+        <w:tc>
+          <w:tcPr>
+            <w:tcW w:type="dxa" w:w="1030"/>
+            <w:tcMar>
+              <w:top w:type="dxa" w:w="60"/>
+              <w:left w:type="dxa" w:w="90"/>
+              <w:bottom w:type="dxa" w:w="60"/>
+              <w:right w:type="dxa" w:w="90"/>
+            </w:tcMar>
+            <w:vAlign w:val="center"/>
+          </w:tcPr>
+          <w:p>
+            <w:pPr>
+              <w:bidi/>
+              <w:spacing w:after="40"/>
+              <w:jc w:val="center"/>
+            </w:pPr>
+            <w:r>
+              <w:rPr>
+                <w:rFonts w:ascii="David" w:cs="David" w:eastAsia="David" w:hAnsi="David"/>
+                <w:b/>
+                <w:bCs/>
+                <w:sz w:val="20"/>
+                <w:szCs w:val="20"/>
+                <w:rtl/>
+              </w:rPr>
+              <w:t xml:space="preserve">טרם נלמד</w:t>
+            </w:r>
+          </w:p>
+        </w:tc>
+        <w:tc>
+          <w:tcPr>
+            <w:tcW w:type="dxa" w:w="1030"/>
+            <w:tcMar>
+              <w:top w:type="dxa" w:w="60"/>
+              <w:left w:type="dxa" w:w="90"/>
+              <w:bottom w:type="dxa" w:w="60"/>
+              <w:right w:type="dxa" w:w="90"/>
+            </w:tcMar>
+            <w:vAlign w:val="center"/>
+          </w:tcPr>
+          <w:p>
+            <w:pPr>
+              <w:bidi/>
+              <w:spacing w:after="40"/>
+              <w:jc w:val="start"/>
+            </w:pPr>
+            <w:r>
+              <w:rPr>
+                <w:rFonts w:ascii="David" w:cs="David" w:eastAsia="David" w:hAnsi="David"/>
+                <w:sz w:val="20"/>
+                <w:szCs w:val="20"/>
+                <w:rtl/>
+              </w:rPr>
+              <w:t xml:space="preserve"/>
+            </w:r>
+          </w:p>
+        </w:tc>
+        <w:tc>
+          <w:tcPr>
+            <w:tcW w:type="dxa" w:w="1040"/>
+            <w:tcMar>
+              <w:top w:type="dxa" w:w="60"/>
+              <w:left w:type="dxa" w:w="90"/>
+              <w:bottom w:type="dxa" w:w="60"/>
+              <w:right w:type="dxa" w:w="90"/>
+            </w:tcMar>
+            <w:vAlign w:val="center"/>
+          </w:tcPr>
+          <w:p>
+            <w:pPr>
+              <w:bidi/>
+              <w:spacing w:after="40"/>
+              <w:jc w:val="start"/>
+            </w:pPr>
+            <w:r>
+              <w:rPr>
+                <w:rFonts w:ascii="David" w:cs="David" w:eastAsia="David" w:hAnsi="David"/>
+                <w:sz w:val="20"/>
+                <w:szCs w:val="20"/>
+                <w:rtl/>
+              </w:rPr>
+              <w:t xml:space="preserve"/>
+            </w:r>
+          </w:p>
+        </w:tc>
+      </w:tr>
+      <w:tr>
+        <w:tc>
+          <w:tcPr>
+            <w:tcW w:type="dxa" w:w="6160"/>
+            <w:tcMar>
+              <w:top w:type="dxa" w:w="60"/>
+              <w:left w:type="dxa" w:w="90"/>
+              <w:bottom w:type="dxa" w:w="60"/>
+              <w:right w:type="dxa" w:w="90"/>
+            </w:tcMar>
+            <w:vAlign w:val="center"/>
+          </w:tcPr>
+          <w:p>
+            <w:pPr>
+              <w:bidi/>
+              <w:spacing w:after="40"/>
+              <w:jc w:val="start"/>
+            </w:pPr>
+            <w:r>
+              <w:rPr>
+                <w:rFonts w:ascii="David" w:cs="David" w:eastAsia="David" w:hAnsi="David"/>
+                <w:sz w:val="20"/>
+                <w:szCs w:val="20"/>
+                <w:rtl/>
+              </w:rPr>
+              <w:t xml:space="preserve">שולף עובדות חילוק</w:t>
+            </w:r>
+          </w:p>
+        </w:tc>
+        <w:tc>
+          <w:tcPr>
+            <w:tcW w:type="dxa" w:w="1030"/>
+            <w:tcMar>
+              <w:top w:type="dxa" w:w="60"/>
+              <w:left w:type="dxa" w:w="90"/>
+              <w:bottom w:type="dxa" w:w="60"/>
+              <w:right w:type="dxa" w:w="90"/>
+            </w:tcMar>
+            <w:vAlign w:val="center"/>
+          </w:tcPr>
+          <w:p>
+            <w:pPr>
+              <w:bidi/>
+              <w:spacing w:after="40"/>
+              <w:jc w:val="center"/>
+            </w:pPr>
+            <w:r>
+              <w:rPr>
+                <w:rFonts w:ascii="David" w:cs="David" w:eastAsia="David" w:hAnsi="David"/>
+                <w:b/>
+                <w:bCs/>
+                <w:sz w:val="20"/>
+                <w:szCs w:val="20"/>
+                <w:rtl/>
+              </w:rPr>
+              <w:t xml:space="preserve">טרם נלמד</w:t>
+            </w:r>
+          </w:p>
+        </w:tc>
+        <w:tc>
+          <w:tcPr>
+            <w:tcW w:type="dxa" w:w="1030"/>
+            <w:tcMar>
+              <w:top w:type="dxa" w:w="60"/>
+              <w:left w:type="dxa" w:w="90"/>
+              <w:bottom w:type="dxa" w:w="60"/>
+              <w:right w:type="dxa" w:w="90"/>
+            </w:tcMar>
+            <w:vAlign w:val="center"/>
+          </w:tcPr>
+          <w:p>
+            <w:pPr>
+              <w:bidi/>
+              <w:spacing w:after="40"/>
+              <w:jc w:val="start"/>
+            </w:pPr>
+            <w:r>
+              <w:rPr>
+                <w:rFonts w:ascii="David" w:cs="David" w:eastAsia="David" w:hAnsi="David"/>
+                <w:sz w:val="20"/>
+                <w:szCs w:val="20"/>
+                <w:rtl/>
+              </w:rPr>
+              <w:t xml:space="preserve"/>
+            </w:r>
+          </w:p>
+        </w:tc>
+        <w:tc>
+          <w:tcPr>
+            <w:tcW w:type="dxa" w:w="1040"/>
+            <w:tcMar>
+              <w:top w:type="dxa" w:w="60"/>
+              <w:left w:type="dxa" w:w="90"/>
+              <w:bottom w:type="dxa" w:w="60"/>
+              <w:right w:type="dxa" w:w="90"/>
+            </w:tcMar>
+            <w:vAlign w:val="center"/>
+          </w:tcPr>
+          <w:p>
+            <w:pPr>
+              <w:bidi/>
+              <w:spacing w:after="40"/>
+              <w:jc w:val="start"/>
+            </w:pPr>
+            <w:r>
+              <w:rPr>
+                <w:rFonts w:ascii="David" w:cs="David" w:eastAsia="David" w:hAnsi="David"/>
+                <w:sz w:val="20"/>
+                <w:szCs w:val="20"/>
+                <w:rtl/>
+              </w:rPr>
+              <w:t xml:space="preserve"/>
+            </w:r>
+          </w:p>
+        </w:tc>
+      </w:tr>
+      <w:tr>
+        <w:tc>
+          <w:tcPr>
+            <w:tcW w:type="dxa" w:w="6160"/>
+            <w:tcMar>
+              <w:top w:type="dxa" w:w="60"/>
+              <w:left w:type="dxa" w:w="90"/>
+              <w:bottom w:type="dxa" w:w="60"/>
+              <w:right w:type="dxa" w:w="90"/>
+            </w:tcMar>
+            <w:vAlign w:val="center"/>
+          </w:tcPr>
+          <w:p>
+            <w:pPr>
+              <w:bidi/>
+              <w:spacing w:after="40"/>
+              <w:jc w:val="start"/>
+            </w:pPr>
+            <w:r>
+              <w:rPr>
+                <w:rFonts w:ascii="David" w:cs="David" w:eastAsia="David" w:hAnsi="David"/>
+                <w:sz w:val="20"/>
+                <w:szCs w:val="20"/>
+                <w:rtl/>
+              </w:rPr>
+              <w:t xml:space="preserve">מבין את הקשר בין פעולת הכפל לבין פעולת החילוק</w:t>
+            </w:r>
+          </w:p>
+        </w:tc>
+        <w:tc>
+          <w:tcPr>
+            <w:tcW w:type="dxa" w:w="1030"/>
+            <w:tcMar>
+              <w:top w:type="dxa" w:w="60"/>
+              <w:left w:type="dxa" w:w="90"/>
+              <w:bottom w:type="dxa" w:w="60"/>
+              <w:right w:type="dxa" w:w="90"/>
+            </w:tcMar>
+            <w:vAlign w:val="center"/>
+          </w:tcPr>
+          <w:p>
+            <w:pPr>
+              <w:bidi/>
+              <w:spacing w:after="40"/>
+              <w:jc w:val="center"/>
+            </w:pPr>
+            <w:r>
+              <w:rPr>
+                <w:rFonts w:ascii="David" w:cs="David" w:eastAsia="David" w:hAnsi="David"/>
+                <w:b/>
+                <w:bCs/>
+                <w:sz w:val="20"/>
+                <w:szCs w:val="20"/>
+                <w:rtl/>
+              </w:rPr>
+              <w:t xml:space="preserve">טרם נלמד</w:t>
+            </w:r>
+          </w:p>
+        </w:tc>
+        <w:tc>
+          <w:tcPr>
+            <w:tcW w:type="dxa" w:w="1030"/>
+            <w:tcMar>
+              <w:top w:type="dxa" w:w="60"/>
+              <w:left w:type="dxa" w:w="90"/>
+              <w:bottom w:type="dxa" w:w="60"/>
+              <w:right w:type="dxa" w:w="90"/>
+            </w:tcMar>
+            <w:vAlign w:val="center"/>
+          </w:tcPr>
+          <w:p>
+            <w:pPr>
+              <w:bidi/>
+              <w:spacing w:after="40"/>
+              <w:jc w:val="start"/>
+            </w:pPr>
+            <w:r>
+              <w:rPr>
+                <w:rFonts w:ascii="David" w:cs="David" w:eastAsia="David" w:hAnsi="David"/>
+                <w:sz w:val="20"/>
+                <w:szCs w:val="20"/>
+                <w:rtl/>
+              </w:rPr>
+              <w:t xml:space="preserve"/>
+            </w:r>
+          </w:p>
+        </w:tc>
+        <w:tc>
+          <w:tcPr>
+            <w:tcW w:type="dxa" w:w="1040"/>
+            <w:tcMar>
+              <w:top w:type="dxa" w:w="60"/>
+              <w:left w:type="dxa" w:w="90"/>
+              <w:bottom w:type="dxa" w:w="60"/>
+              <w:right w:type="dxa" w:w="90"/>
+            </w:tcMar>
+            <w:vAlign w:val="center"/>
+          </w:tcPr>
+          <w:p>
+            <w:pPr>
+              <w:bidi/>
+              <w:spacing w:after="40"/>
+              <w:jc w:val="start"/>
+            </w:pPr>
+            <w:r>
+              <w:rPr>
+                <w:rFonts w:ascii="David" w:cs="David" w:eastAsia="David" w:hAnsi="David"/>
+                <w:sz w:val="20"/>
+                <w:szCs w:val="20"/>
+                <w:rtl/>
+              </w:rPr>
+              <w:t xml:space="preserve"/>
+            </w:r>
+          </w:p>
+        </w:tc>
+      </w:tr>
+      <w:tr>
+        <w:tc>
+          <w:tcPr>
+            <w:tcW w:type="dxa" w:w="9260"/>
+            <w:gridSpan w:val="4"/>
+            <w:shd w:fill="EDEDED" w:color="auto" w:val="clear"/>
+            <w:tcMar>
+              <w:top w:type="dxa" w:w="60"/>
+              <w:left w:type="dxa" w:w="90"/>
+              <w:bottom w:type="dxa" w:w="60"/>
+              <w:right w:type="dxa" w:w="90"/>
+            </w:tcMar>
+            <w:vAlign w:val="center"/>
+          </w:tcPr>
+          <w:p>
+            <w:pPr>
+              <w:bidi/>
+              <w:spacing w:after="40"/>
+              <w:jc w:val="start"/>
+            </w:pPr>
+            <w:r>
+              <w:rPr>
+                <w:rFonts w:ascii="David" w:cs="David" w:eastAsia="David" w:hAnsi="David"/>
+                <w:b/>
+                <w:bCs/>
+                <w:sz w:val="20"/>
+                <w:szCs w:val="20"/>
+                <w:rtl/>
+              </w:rPr>
+              <w:t xml:space="preserve">סדר הפעולות</w:t>
+            </w:r>
+          </w:p>
+        </w:tc>
+      </w:tr>
+      <w:tr>
+        <w:tc>
+          <w:tcPr>
+            <w:tcW w:type="dxa" w:w="6160"/>
+            <w:tcMar>
+              <w:top w:type="dxa" w:w="60"/>
+              <w:left w:type="dxa" w:w="90"/>
+              <w:bottom w:type="dxa" w:w="60"/>
+              <w:right w:type="dxa" w:w="90"/>
+            </w:tcMar>
+            <w:vAlign w:val="center"/>
+          </w:tcPr>
+          <w:p>
+            <w:pPr>
+              <w:bidi/>
+              <w:spacing w:after="40"/>
+              <w:jc w:val="start"/>
+            </w:pPr>
+            <w:r>
+              <w:rPr>
+                <w:rFonts w:ascii="David" w:cs="David" w:eastAsia="David" w:hAnsi="David"/>
+                <w:sz w:val="20"/>
+                <w:szCs w:val="20"/>
+                <w:rtl/>
+              </w:rPr>
+              <w:t xml:space="preserve">שולט בסדר פעולות החשבון וסוגריים</w:t>
+            </w:r>
+          </w:p>
+        </w:tc>
+        <w:tc>
+          <w:tcPr>
+            <w:tcW w:type="dxa" w:w="1030"/>
+            <w:tcMar>
+              <w:top w:type="dxa" w:w="60"/>
+              <w:left w:type="dxa" w:w="90"/>
+              <w:bottom w:type="dxa" w:w="60"/>
+              <w:right w:type="dxa" w:w="90"/>
+            </w:tcMar>
+            <w:vAlign w:val="center"/>
+          </w:tcPr>
+          <w:p>
+            <w:pPr>
+              <w:bidi/>
+              <w:spacing w:after="40"/>
+              <w:jc w:val="center"/>
+            </w:pPr>
+            <w:r>
+              <w:rPr>
+                <w:rFonts w:ascii="David" w:cs="David" w:eastAsia="David" w:hAnsi="David"/>
+                <w:b/>
+                <w:bCs/>
+                <w:sz w:val="20"/>
+                <w:szCs w:val="20"/>
+                <w:rtl/>
+              </w:rPr>
+              <w:t xml:space="preserve">טרם נלמד</w:t>
+            </w:r>
+          </w:p>
+        </w:tc>
+        <w:tc>
+          <w:tcPr>
+            <w:tcW w:type="dxa" w:w="1030"/>
+            <w:tcMar>
+              <w:top w:type="dxa" w:w="60"/>
+              <w:left w:type="dxa" w:w="90"/>
+              <w:bottom w:type="dxa" w:w="60"/>
+              <w:right w:type="dxa" w:w="90"/>
+            </w:tcMar>
+            <w:vAlign w:val="center"/>
+          </w:tcPr>
+          <w:p>
+            <w:pPr>
+              <w:bidi/>
+              <w:spacing w:after="40"/>
+              <w:jc w:val="start"/>
+            </w:pPr>
+            <w:r>
+              <w:rPr>
+                <w:rFonts w:ascii="David" w:cs="David" w:eastAsia="David" w:hAnsi="David"/>
+                <w:sz w:val="20"/>
+                <w:szCs w:val="20"/>
+                <w:rtl/>
+              </w:rPr>
+              <w:t xml:space="preserve"/>
+            </w:r>
+          </w:p>
+        </w:tc>
+        <w:tc>
+          <w:tcPr>
+            <w:tcW w:type="dxa" w:w="1040"/>
+            <w:tcMar>
+              <w:top w:type="dxa" w:w="60"/>
+              <w:left w:type="dxa" w:w="90"/>
+              <w:bottom w:type="dxa" w:w="60"/>
+              <w:right w:type="dxa" w:w="90"/>
+            </w:tcMar>
+            <w:vAlign w:val="center"/>
+          </w:tcPr>
+          <w:p>
+            <w:pPr>
+              <w:bidi/>
+              <w:spacing w:after="40"/>
+              <w:jc w:val="start"/>
+            </w:pPr>
+            <w:r>
+              <w:rPr>
+                <w:rFonts w:ascii="David" w:cs="David" w:eastAsia="David" w:hAnsi="David"/>
+                <w:sz w:val="20"/>
+                <w:szCs w:val="20"/>
+                <w:rtl/>
+              </w:rPr>
+              <w:t xml:space="preserve"/>
+            </w:r>
+          </w:p>
+        </w:tc>
+      </w:tr>
+      <w:tr>
+        <w:tc>
+          <w:tcPr>
+            <w:tcW w:type="dxa" w:w="6160"/>
+            <w:tcMar>
+              <w:top w:type="dxa" w:w="60"/>
+              <w:left w:type="dxa" w:w="90"/>
+              <w:bottom w:type="dxa" w:w="60"/>
+              <w:right w:type="dxa" w:w="90"/>
+            </w:tcMar>
+            <w:vAlign w:val="center"/>
+          </w:tcPr>
+          <w:p>
+            <w:pPr>
+              <w:bidi/>
+              <w:spacing w:after="40"/>
+              <w:jc w:val="start"/>
+            </w:pPr>
+            <w:r>
+              <w:rPr>
+                <w:rFonts w:ascii="David" w:cs="David" w:eastAsia="David" w:hAnsi="David"/>
+                <w:sz w:val="20"/>
+                <w:szCs w:val="20"/>
+                <w:rtl/>
+              </w:rPr>
+              <w:t xml:space="preserve">פותר שאלות מילוליות עם ארבע פעולות חשבון</w:t>
+            </w:r>
+          </w:p>
+        </w:tc>
+        <w:tc>
+          <w:tcPr>
+            <w:tcW w:type="dxa" w:w="1030"/>
+            <w:tcMar>
+              <w:top w:type="dxa" w:w="60"/>
+              <w:left w:type="dxa" w:w="90"/>
+              <w:bottom w:type="dxa" w:w="60"/>
+              <w:right w:type="dxa" w:w="90"/>
+            </w:tcMar>
+            <w:vAlign w:val="center"/>
+          </w:tcPr>
+          <w:p>
+            <w:pPr>
+              <w:bidi/>
+              <w:spacing w:after="40"/>
+              <w:jc w:val="center"/>
+            </w:pPr>
+            <w:r>
+              <w:rPr>
+                <w:rFonts w:ascii="David" w:cs="David" w:eastAsia="David" w:hAnsi="David"/>
+                <w:b/>
+                <w:bCs/>
+                <w:sz w:val="20"/>
+                <w:szCs w:val="20"/>
+                <w:rtl/>
+              </w:rPr>
+              <w:t xml:space="preserve">טרם נלמד</w:t>
             </w:r>
           </w:p>
         </w:tc>

</xml_diff>

<commit_message>
Fill the original diagnostic booklet and expand the intervention program
New file: the official whole-numbers diagnostic template itself, filled
per the student - background fields completed and every performance
cell in all 18 assessment tables documented with the student's
responses, consistent with the analysis ratings.

Mapping document: the work program section is now a full intervention
program - overarching goal, six general goals, teaching principles,
and a five-column table per lesson (topic, operative goals, means and
strategies, evaluation), each evaluation tied back to the specific
mapping items the student failed.

Co-Authored-By: Claude Fable 5 <noreply@anthropic.com>
Claude-Session: https://claude.ai/code/session_01EMxFUHHVvpa8bYzfYkV3bj
</commit_message>
<xml_diff>
--- a/lesson-plan/מיפוי-ותוכנית-עבודה.docx
+++ b/lesson-plan/מיפוי-ותוכנית-עבודה.docx
@@ -19621,7 +19621,123 @@
           <w:u w:val="single"/>
           <w:rtl/>
         </w:rPr>
-        <w:t xml:space="preserve">ו. תוכנית עבודה (10 שיעורים פרטניים, 45 דק' כל אחד)</w:t>
+        <w:t xml:space="preserve">ו. תוכנית התערבות (10 שיעורים פרטניים, 45 דק' כל אחד)</w:t>
+      </w:r>
+    </w:p>
+    <w:p>
+      <w:pPr>
+        <w:bidi/>
+        <w:spacing w:after="120" w:before="0"/>
+        <w:jc w:val="start"/>
+      </w:pPr>
+      <w:r>
+        <w:rPr>
+          <w:rFonts w:ascii="David" w:cs="David" w:eastAsia="David" w:hAnsi="David"/>
+          <w:b/>
+          <w:bCs/>
+          <w:sz w:val="22"/>
+          <w:szCs w:val="22"/>
+          <w:rtl/>
+        </w:rPr>
+        <w:t xml:space="preserve">מטרת על: שיפור יכולותיו המתמטיות של התלמיד באמצעות ביסוס הבנת המבנה העשרוני של המספר, כתשתית לחיבור ולחיסור עם המרה ופריטה.</w:t>
+      </w:r>
+    </w:p>
+    <w:p>
+      <w:pPr>
+        <w:bidi/>
+        <w:spacing w:after="120" w:before="0"/>
+        <w:jc w:val="start"/>
+      </w:pPr>
+      <w:r>
+        <w:rPr>
+          <w:rFonts w:ascii="David" w:cs="David" w:eastAsia="David" w:hAnsi="David"/>
+          <w:b/>
+          <w:bCs/>
+          <w:sz w:val="22"/>
+          <w:szCs w:val="22"/>
+          <w:rtl/>
+        </w:rPr>
+        <w:t xml:space="preserve">מטרות כלליות של התוכנית:</w:t>
+      </w:r>
+    </w:p>
+    <w:p>
+      <w:pPr>
+        <w:bidi/>
+        <w:spacing w:after="40" w:before="0"/>
+        <w:jc w:val="start"/>
+      </w:pPr>
+      <w:r>
+        <w:rPr>
+          <w:rFonts w:ascii="David" w:cs="David" w:eastAsia="David" w:hAnsi="David"/>
+          <w:sz w:val="22"/>
+          <w:szCs w:val="22"/>
+          <w:rtl/>
+        </w:rPr>
+        <w:t xml:space="preserve">1. התלמיד יבין את המבנה העשרוני של המספרים בתחום ה-100 ואת ערך המקום.</w:t>
+      </w:r>
+    </w:p>
+    <w:p>
+      <w:pPr>
+        <w:bidi/>
+        <w:spacing w:after="40" w:before="0"/>
+        <w:jc w:val="start"/>
+      </w:pPr>
+      <w:r>
+        <w:rPr>
+          <w:rFonts w:ascii="David" w:cs="David" w:eastAsia="David" w:hAnsi="David"/>
+          <w:sz w:val="22"/>
+          <w:szCs w:val="22"/>
+          <w:rtl/>
+        </w:rPr>
+        <w:t xml:space="preserve">2. התלמיד ישלוט בהמרה ובפריטה כפעולות הופכיות, במגוון ייצוגים.</w:t>
+      </w:r>
+    </w:p>
+    <w:p>
+      <w:pPr>
+        <w:bidi/>
+        <w:spacing w:after="40" w:before="0"/>
+        <w:jc w:val="start"/>
+      </w:pPr>
+      <w:r>
+        <w:rPr>
+          <w:rFonts w:ascii="David" w:cs="David" w:eastAsia="David" w:hAnsi="David"/>
+          <w:sz w:val="22"/>
+          <w:szCs w:val="22"/>
+          <w:rtl/>
+        </w:rPr>
+        <w:t xml:space="preserve">3. התלמיד ישלוף עובדות חיבור וחיסור בתחום ה-20, כולל שבירת עשרת, ללא מנייה באצבעות.</w:t>
+      </w:r>
+    </w:p>
+    <w:p>
+      <w:pPr>
+        <w:bidi/>
+        <w:spacing w:after="40" w:before="0"/>
+        <w:jc w:val="start"/>
+      </w:pPr>
+      <w:r>
+        <w:rPr>
+          <w:rFonts w:ascii="David" w:cs="David" w:eastAsia="David" w:hAnsi="David"/>
+          <w:sz w:val="22"/>
+          <w:szCs w:val="22"/>
+          <w:rtl/>
+        </w:rPr>
+        <w:t xml:space="preserve">4. התלמיד יפתור תרגילי חיבור עם המרה וחיסור עם פריטה בתחום ה-100, במאונך ובמאוזן.</w:t>
+      </w:r>
+    </w:p>
+    <w:p>
+      <w:pPr>
+        <w:bidi/>
+        <w:spacing w:after="40" w:before="0"/>
+        <w:jc w:val="start"/>
+      </w:pPr>
+      <w:r>
+        <w:rPr>
+          <w:rFonts w:ascii="David" w:cs="David" w:eastAsia="David" w:hAnsi="David"/>
+          <w:sz w:val="22"/>
+          <w:szCs w:val="22"/>
+          <w:rtl/>
+        </w:rPr>
+        <w:t xml:space="preserve">5. התלמיד ייישם את הנלמד בבעיות מילוליות מחיי היומיום.</w:t>
       </w:r>
     </w:p>
     <w:p>
@@ -19637,7 +19753,23 @@
           <w:szCs w:val="22"/>
           <w:rtl/>
         </w:rPr>
-        <w:t xml:space="preserve">מטרת העל של התוכנית: שיפור יכולותיו המתמטיות של התלמיד באמצעות ביסוס הבנת המבנה העשרוני, כתשתית לחיבור ולחיסור עם המרה ופריטה. מטרות השיעור הראשון, הכלליות והאופרטיביות, מפורטות במערך השיעור המצורף בקובץ נפרד.</w:t>
+        <w:t xml:space="preserve">6. התלמיד יחזק את תחושת המסוגלות המתמטית שלו ואת הרגל הבדיקה העצמית.</w:t>
+      </w:r>
+    </w:p>
+    <w:p>
+      <w:pPr>
+        <w:bidi/>
+        <w:spacing w:after="120" w:before="0"/>
+        <w:jc w:val="start"/>
+      </w:pPr>
+      <w:r>
+        <w:rPr>
+          <w:rFonts w:ascii="David" w:cs="David" w:eastAsia="David" w:hAnsi="David"/>
+          <w:sz w:val="22"/>
+          <w:szCs w:val="22"/>
+          <w:rtl/>
+        </w:rPr>
+        <w:t xml:space="preserve">עקרונות ההוראה לאורך כל התוכנית: התקדמות ברצף דרגי ההוראה (מוחשי, תמונתי, מופשט) עם ירידת דרג בכל טעות; "עוקפים ולא תוקפים"; למידה משחקית ומתוקשבת; טבלה מצטברת אישית כאמצעי מטה-קוגניטיבי; פתיחת כל שיעור בבדיקת שימור וסיומו בחוויית הצלחה; ומשימות בית קצרות המקשרות לסביבה הביתית.</w:t>
       </w:r>
     </w:p>
     <w:tbl>
@@ -19654,14 +19786,16 @@
         </w:tblBorders>
       </w:tblPr>
       <w:tblGrid>
-        <w:gridCol w:w="1300"/>
-        <w:gridCol w:w="3300"/>
-        <w:gridCol w:w="4660"/>
+        <w:gridCol w:w="800"/>
+        <w:gridCol w:w="1750"/>
+        <w:gridCol w:w="2600"/>
+        <w:gridCol w:w="2650"/>
+        <w:gridCol w:w="1460"/>
       </w:tblGrid>
       <w:tr>
         <w:tc>
           <w:tcPr>
-            <w:tcW w:type="dxa" w:w="1300"/>
+            <w:tcW w:type="dxa" w:w="800"/>
             <w:shd w:fill="D9E2F3" w:color="auto" w:val="clear"/>
             <w:tcMar>
               <w:top w:type="dxa" w:w="60"/>
@@ -19682,17 +19816,17 @@
                 <w:rFonts w:ascii="David" w:cs="David" w:eastAsia="David" w:hAnsi="David"/>
                 <w:b/>
                 <w:bCs/>
-                <w:sz w:val="22"/>
-                <w:szCs w:val="22"/>
-                <w:rtl/>
-              </w:rPr>
-              <w:t xml:space="preserve">שיעורים</w:t>
-            </w:r>
-          </w:p>
-        </w:tc>
-        <w:tc>
-          <w:tcPr>
-            <w:tcW w:type="dxa" w:w="3300"/>
+                <w:sz w:val="20"/>
+                <w:szCs w:val="20"/>
+                <w:rtl/>
+              </w:rPr>
+              <w:t xml:space="preserve">שיעור</w:t>
+            </w:r>
+          </w:p>
+        </w:tc>
+        <w:tc>
+          <w:tcPr>
+            <w:tcW w:type="dxa" w:w="1750"/>
             <w:shd w:fill="D9E2F3" w:color="auto" w:val="clear"/>
             <w:tcMar>
               <w:top w:type="dxa" w:w="60"/>
@@ -19713,17 +19847,17 @@
                 <w:rFonts w:ascii="David" w:cs="David" w:eastAsia="David" w:hAnsi="David"/>
                 <w:b/>
                 <w:bCs/>
-                <w:sz w:val="22"/>
-                <w:szCs w:val="22"/>
-                <w:rtl/>
-              </w:rPr>
-              <w:t xml:space="preserve">נושא ומטרה</w:t>
-            </w:r>
-          </w:p>
-        </w:tc>
-        <w:tc>
-          <w:tcPr>
-            <w:tcW w:type="dxa" w:w="4660"/>
+                <w:sz w:val="20"/>
+                <w:szCs w:val="20"/>
+                <w:rtl/>
+              </w:rPr>
+              <w:t xml:space="preserve">נושא</w:t>
+            </w:r>
+          </w:p>
+        </w:tc>
+        <w:tc>
+          <w:tcPr>
+            <w:tcW w:type="dxa" w:w="2600"/>
             <w:shd w:fill="D9E2F3" w:color="auto" w:val="clear"/>
             <w:tcMar>
               <w:top w:type="dxa" w:w="60"/>
@@ -19744,19 +19878,81 @@
                 <w:rFonts w:ascii="David" w:cs="David" w:eastAsia="David" w:hAnsi="David"/>
                 <w:b/>
                 <w:bCs/>
-                <w:sz w:val="22"/>
-                <w:szCs w:val="22"/>
-                <w:rtl/>
-              </w:rPr>
-              <w:t xml:space="preserve">פירוט ואסטרטגיות מהקורס</w:t>
-            </w:r>
-          </w:p>
-        </w:tc>
-      </w:tr>
-      <w:tr>
-        <w:tc>
-          <w:tcPr>
-            <w:tcW w:type="dxa" w:w="1300"/>
+                <w:sz w:val="20"/>
+                <w:szCs w:val="20"/>
+                <w:rtl/>
+              </w:rPr>
+              <w:t xml:space="preserve">מטרות אופרטיביות לתלמיד</w:t>
+            </w:r>
+          </w:p>
+        </w:tc>
+        <w:tc>
+          <w:tcPr>
+            <w:tcW w:type="dxa" w:w="2650"/>
+            <w:shd w:fill="D9E2F3" w:color="auto" w:val="clear"/>
+            <w:tcMar>
+              <w:top w:type="dxa" w:w="60"/>
+              <w:left w:type="dxa" w:w="90"/>
+              <w:bottom w:type="dxa" w:w="60"/>
+              <w:right w:type="dxa" w:w="90"/>
+            </w:tcMar>
+            <w:vAlign w:val="center"/>
+          </w:tcPr>
+          <w:p>
+            <w:pPr>
+              <w:bidi/>
+              <w:spacing w:after="40"/>
+              <w:jc w:val="start"/>
+            </w:pPr>
+            <w:r>
+              <w:rPr>
+                <w:rFonts w:ascii="David" w:cs="David" w:eastAsia="David" w:hAnsi="David"/>
+                <w:b/>
+                <w:bCs/>
+                <w:sz w:val="20"/>
+                <w:szCs w:val="20"/>
+                <w:rtl/>
+              </w:rPr>
+              <w:t xml:space="preserve">פירוט, אמצעים ואסטרטגיות</w:t>
+            </w:r>
+          </w:p>
+        </w:tc>
+        <w:tc>
+          <w:tcPr>
+            <w:tcW w:type="dxa" w:w="1460"/>
+            <w:shd w:fill="D9E2F3" w:color="auto" w:val="clear"/>
+            <w:tcMar>
+              <w:top w:type="dxa" w:w="60"/>
+              <w:left w:type="dxa" w:w="90"/>
+              <w:bottom w:type="dxa" w:w="60"/>
+              <w:right w:type="dxa" w:w="90"/>
+            </w:tcMar>
+            <w:vAlign w:val="center"/>
+          </w:tcPr>
+          <w:p>
+            <w:pPr>
+              <w:bidi/>
+              <w:spacing w:after="40"/>
+              <w:jc w:val="start"/>
+            </w:pPr>
+            <w:r>
+              <w:rPr>
+                <w:rFonts w:ascii="David" w:cs="David" w:eastAsia="David" w:hAnsi="David"/>
+                <w:b/>
+                <w:bCs/>
+                <w:sz w:val="20"/>
+                <w:szCs w:val="20"/>
+                <w:rtl/>
+              </w:rPr>
+              <w:t xml:space="preserve">הערכה</w:t>
+            </w:r>
+          </w:p>
+        </w:tc>
+      </w:tr>
+      <w:tr>
+        <w:tc>
+          <w:tcPr>
+            <w:tcW w:type="dxa" w:w="800"/>
             <w:tcMar>
               <w:top w:type="dxa" w:w="60"/>
               <w:left w:type="dxa" w:w="90"/>
@@ -19784,7 +19980,7 @@
         </w:tc>
         <w:tc>
           <w:tcPr>
-            <w:tcW w:type="dxa" w:w="3300"/>
+            <w:tcW w:type="dxa" w:w="1750"/>
             <w:tcMar>
               <w:top w:type="dxa" w:w="60"/>
               <w:left w:type="dxa" w:w="90"/>
@@ -19812,37 +20008,141 @@
         </w:tc>
         <w:tc>
           <w:tcPr>
-            <w:tcW w:type="dxa" w:w="4660"/>
-            <w:tcMar>
-              <w:top w:type="dxa" w:w="60"/>
-              <w:left w:type="dxa" w:w="90"/>
-              <w:bottom w:type="dxa" w:w="60"/>
-              <w:right w:type="dxa" w:w="90"/>
-            </w:tcMar>
-            <w:vAlign w:val="center"/>
-          </w:tcPr>
-          <w:p>
-            <w:pPr>
-              <w:bidi/>
-              <w:spacing w:after="40"/>
-              <w:jc w:val="start"/>
-            </w:pPr>
-            <w:r>
-              <w:rPr>
-                <w:rFonts w:ascii="David" w:cs="David" w:eastAsia="David" w:hAnsi="David"/>
-                <w:sz w:val="20"/>
-                <w:szCs w:val="20"/>
-                <w:rtl/>
-              </w:rPr>
-              <w:t xml:space="preserve">עבודה בדרג המוחשי (בדידי דיינס, מטבעות) ומעבר מדורג לדרג התמונתי והסמלי. פתיחת "טבלה מצטברת" אישית שתלווה את כל התוכנית, והתלמיד יסמן בה בכל שיעור את מה שנלמד. שיעור 1 מפורט במערך השיעור המצורף בקובץ נפרד.</w:t>
-            </w:r>
-          </w:p>
-        </w:tc>
-      </w:tr>
-      <w:tr>
-        <w:tc>
-          <w:tcPr>
-            <w:tcW w:type="dxa" w:w="1300"/>
+            <w:tcW w:type="dxa" w:w="2600"/>
+            <w:tcMar>
+              <w:top w:type="dxa" w:w="60"/>
+              <w:left w:type="dxa" w:w="90"/>
+              <w:bottom w:type="dxa" w:w="60"/>
+              <w:right w:type="dxa" w:w="90"/>
+            </w:tcMar>
+            <w:vAlign w:val="center"/>
+          </w:tcPr>
+          <w:p>
+            <w:pPr>
+              <w:bidi/>
+              <w:spacing w:after="40"/>
+              <w:jc w:val="start"/>
+            </w:pPr>
+            <w:r>
+              <w:rPr>
+                <w:rFonts w:ascii="David" w:cs="David" w:eastAsia="David" w:hAnsi="David"/>
+                <w:sz w:val="20"/>
+                <w:szCs w:val="20"/>
+                <w:rtl/>
+              </w:rPr>
+              <w:t xml:space="preserve">ימיר 10 בדידי אחדות במוט עשרת ויאמר כמה עשרות ואחדות התקבלו (4 מתוך 5).</w:t>
+            </w:r>
+          </w:p>
+          <w:p>
+            <w:pPr>
+              <w:bidi/>
+              <w:spacing w:after="40"/>
+              <w:jc w:val="start"/>
+            </w:pPr>
+            <w:r>
+              <w:rPr>
+                <w:rFonts w:ascii="David" w:cs="David" w:eastAsia="David" w:hAnsi="David"/>
+                <w:sz w:val="20"/>
+                <w:szCs w:val="20"/>
+                <w:rtl/>
+              </w:rPr>
+              <w:t xml:space="preserve">יסביר שהכמות נשמרת בהחלפה.</w:t>
+            </w:r>
+          </w:p>
+          <w:p>
+            <w:pPr>
+              <w:bidi/>
+              <w:spacing w:after="40"/>
+              <w:jc w:val="start"/>
+            </w:pPr>
+            <w:r>
+              <w:rPr>
+                <w:rFonts w:ascii="David" w:cs="David" w:eastAsia="David" w:hAnsi="David"/>
+                <w:sz w:val="20"/>
+                <w:szCs w:val="20"/>
+                <w:rtl/>
+              </w:rPr>
+              <w:t xml:space="preserve">ישלים בכתב משפטי המרה (4 מתוך 5).</w:t>
+            </w:r>
+          </w:p>
+          <w:p>
+            <w:pPr>
+              <w:bidi/>
+              <w:spacing w:after="40"/>
+              <w:jc w:val="start"/>
+            </w:pPr>
+            <w:r>
+              <w:rPr>
+                <w:rFonts w:ascii="David" w:cs="David" w:eastAsia="David" w:hAnsi="David"/>
+                <w:sz w:val="20"/>
+                <w:szCs w:val="20"/>
+                <w:rtl/>
+              </w:rPr>
+              <w:t xml:space="preserve">ינסח את "חוק ההחלפה" במילותיו.</w:t>
+            </w:r>
+          </w:p>
+        </w:tc>
+        <w:tc>
+          <w:tcPr>
+            <w:tcW w:type="dxa" w:w="2650"/>
+            <w:tcMar>
+              <w:top w:type="dxa" w:w="60"/>
+              <w:left w:type="dxa" w:w="90"/>
+              <w:bottom w:type="dxa" w:w="60"/>
+              <w:right w:type="dxa" w:w="90"/>
+            </w:tcMar>
+            <w:vAlign w:val="center"/>
+          </w:tcPr>
+          <w:p>
+            <w:pPr>
+              <w:bidi/>
+              <w:spacing w:after="40"/>
+              <w:jc w:val="start"/>
+            </w:pPr>
+            <w:r>
+              <w:rPr>
+                <w:rFonts w:ascii="David" w:cs="David" w:eastAsia="David" w:hAnsi="David"/>
+                <w:sz w:val="20"/>
+                <w:szCs w:val="20"/>
+                <w:rtl/>
+              </w:rPr>
+              <w:t xml:space="preserve">עבודה בדרג המוחשי (בדידי דיינס, מטבעות ב"בנק ההמרות") ומעבר מדורג לתמונתי ולסמלי. פתיחת טבלה מצטברת אישית שתלווה את כל התוכנית. מערך שיעור 1 מצורף בקובץ נפרד.</w:t>
+            </w:r>
+          </w:p>
+        </w:tc>
+        <w:tc>
+          <w:tcPr>
+            <w:tcW w:type="dxa" w:w="1460"/>
+            <w:tcMar>
+              <w:top w:type="dxa" w:w="60"/>
+              <w:left w:type="dxa" w:w="90"/>
+              <w:bottom w:type="dxa" w:w="60"/>
+              <w:right w:type="dxa" w:w="90"/>
+            </w:tcMar>
+            <w:vAlign w:val="center"/>
+          </w:tcPr>
+          <w:p>
+            <w:pPr>
+              <w:bidi/>
+              <w:spacing w:after="40"/>
+              <w:jc w:val="start"/>
+            </w:pPr>
+            <w:r>
+              <w:rPr>
+                <w:rFonts w:ascii="David" w:cs="David" w:eastAsia="David" w:hAnsi="David"/>
+                <w:sz w:val="20"/>
+                <w:szCs w:val="20"/>
+                <w:rtl/>
+              </w:rPr>
+              <w:t xml:space="preserve">דף משפטי השלמה (מחוון 4 מתוך 5), תצפית מתועדת, בדיקת שימור בפתיחת שיעור 3.</w:t>
+            </w:r>
+          </w:p>
+        </w:tc>
+      </w:tr>
+      <w:tr>
+        <w:tc>
+          <w:tcPr>
+            <w:tcW w:type="dxa" w:w="800"/>
             <w:tcMar>
               <w:top w:type="dxa" w:w="60"/>
               <w:left w:type="dxa" w:w="90"/>
@@ -19870,7 +20170,7 @@
         </w:tc>
         <w:tc>
           <w:tcPr>
-            <w:tcW w:type="dxa" w:w="3300"/>
+            <w:tcW w:type="dxa" w:w="1750"/>
             <w:tcMar>
               <w:top w:type="dxa" w:w="60"/>
               <w:left w:type="dxa" w:w="90"/>
@@ -19898,37 +20198,125 @@
         </w:tc>
         <w:tc>
           <w:tcPr>
-            <w:tcW w:type="dxa" w:w="4660"/>
-            <w:tcMar>
-              <w:top w:type="dxa" w:w="60"/>
-              <w:left w:type="dxa" w:w="90"/>
-              <w:bottom w:type="dxa" w:w="60"/>
-              <w:right w:type="dxa" w:w="90"/>
-            </w:tcMar>
-            <w:vAlign w:val="center"/>
-          </w:tcPr>
-          <w:p>
-            <w:pPr>
-              <w:bidi/>
-              <w:spacing w:after="40"/>
-              <w:jc w:val="start"/>
-            </w:pPr>
-            <w:r>
-              <w:rPr>
-                <w:rFonts w:ascii="David" w:cs="David" w:eastAsia="David" w:hAnsi="David"/>
-                <w:sz w:val="20"/>
-                <w:szCs w:val="20"/>
-                <w:rtl/>
-              </w:rPr>
-              <w:t xml:space="preserve">הפעולה ההופכית להמרה: פריטת מוט עשרת לבדידי אחדות ופריטת מטבע 10 ש"ח לשקלים בודדים ("בנק ההמרות"), הכלה למספר ולמקום.</w:t>
-            </w:r>
-          </w:p>
-        </w:tc>
-      </w:tr>
-      <w:tr>
-        <w:tc>
-          <w:tcPr>
-            <w:tcW w:type="dxa" w:w="1300"/>
+            <w:tcW w:type="dxa" w:w="2600"/>
+            <w:tcMar>
+              <w:top w:type="dxa" w:w="60"/>
+              <w:left w:type="dxa" w:w="90"/>
+              <w:bottom w:type="dxa" w:w="60"/>
+              <w:right w:type="dxa" w:w="90"/>
+            </w:tcMar>
+            <w:vAlign w:val="center"/>
+          </w:tcPr>
+          <w:p>
+            <w:pPr>
+              <w:bidi/>
+              <w:spacing w:after="40"/>
+              <w:jc w:val="start"/>
+            </w:pPr>
+            <w:r>
+              <w:rPr>
+                <w:rFonts w:ascii="David" w:cs="David" w:eastAsia="David" w:hAnsi="David"/>
+                <w:sz w:val="20"/>
+                <w:szCs w:val="20"/>
+                <w:rtl/>
+              </w:rPr>
+              <w:t xml:space="preserve">יפרוט מוט עשרת ל-10 אחדות (4 מתוך 5).</w:t>
+            </w:r>
+          </w:p>
+          <w:p>
+            <w:pPr>
+              <w:bidi/>
+              <w:spacing w:after="40"/>
+              <w:jc w:val="start"/>
+            </w:pPr>
+            <w:r>
+              <w:rPr>
+                <w:rFonts w:ascii="David" w:cs="David" w:eastAsia="David" w:hAnsi="David"/>
+                <w:sz w:val="20"/>
+                <w:szCs w:val="20"/>
+                <w:rtl/>
+              </w:rPr>
+              <w:t xml:space="preserve">יענה על שאלות הכלה: "כמה אחדות מכיל 14?", "כמה אחדות ב-2 עשרות?" (4 מתוך 5).</w:t>
+            </w:r>
+          </w:p>
+          <w:p>
+            <w:pPr>
+              <w:bidi/>
+              <w:spacing w:after="40"/>
+              <w:jc w:val="start"/>
+            </w:pPr>
+            <w:r>
+              <w:rPr>
+                <w:rFonts w:ascii="David" w:cs="David" w:eastAsia="David" w:hAnsi="David"/>
+                <w:sz w:val="20"/>
+                <w:szCs w:val="20"/>
+                <w:rtl/>
+              </w:rPr>
+              <w:t xml:space="preserve">ינסח את חוק ההחלפה הדו-כיווני.</w:t>
+            </w:r>
+          </w:p>
+        </w:tc>
+        <w:tc>
+          <w:tcPr>
+            <w:tcW w:type="dxa" w:w="2650"/>
+            <w:tcMar>
+              <w:top w:type="dxa" w:w="60"/>
+              <w:left w:type="dxa" w:w="90"/>
+              <w:bottom w:type="dxa" w:w="60"/>
+              <w:right w:type="dxa" w:w="90"/>
+            </w:tcMar>
+            <w:vAlign w:val="center"/>
+          </w:tcPr>
+          <w:p>
+            <w:pPr>
+              <w:bidi/>
+              <w:spacing w:after="40"/>
+              <w:jc w:val="start"/>
+            </w:pPr>
+            <w:r>
+              <w:rPr>
+                <w:rFonts w:ascii="David" w:cs="David" w:eastAsia="David" w:hAnsi="David"/>
+                <w:sz w:val="20"/>
+                <w:szCs w:val="20"/>
+                <w:rtl/>
+              </w:rPr>
+              <w:t xml:space="preserve">הפעולה ההופכית להמרה: פריטת מוט עשרת ופריטת מטבע 10 ש"ח לתשלום סכום קטן. משחק "החלפות מהירות" המערבב המרה ופריטה. מערך שיעור 3 מצורף בקובץ נפרד.</w:t>
+            </w:r>
+          </w:p>
+        </w:tc>
+        <w:tc>
+          <w:tcPr>
+            <w:tcW w:type="dxa" w:w="1460"/>
+            <w:tcMar>
+              <w:top w:type="dxa" w:w="60"/>
+              <w:left w:type="dxa" w:w="90"/>
+              <w:bottom w:type="dxa" w:w="60"/>
+              <w:right w:type="dxa" w:w="90"/>
+            </w:tcMar>
+            <w:vAlign w:val="center"/>
+          </w:tcPr>
+          <w:p>
+            <w:pPr>
+              <w:bidi/>
+              <w:spacing w:after="40"/>
+              <w:jc w:val="start"/>
+            </w:pPr>
+            <w:r>
+              <w:rPr>
+                <w:rFonts w:ascii="David" w:cs="David" w:eastAsia="David" w:hAnsi="David"/>
+                <w:sz w:val="20"/>
+                <w:szCs w:val="20"/>
+                <w:rtl/>
+              </w:rPr>
+              <w:t xml:space="preserve">שאלות ההכלה מהמיפוי שבהן נכשל ("כמה אחדות מכיל 25?") נבדקות מחדש.</w:t>
+            </w:r>
+          </w:p>
+        </w:tc>
+      </w:tr>
+      <w:tr>
+        <w:tc>
+          <w:tcPr>
+            <w:tcW w:type="dxa" w:w="800"/>
             <w:tcMar>
               <w:top w:type="dxa" w:w="60"/>
               <w:left w:type="dxa" w:w="90"/>
@@ -19956,65 +20344,153 @@
         </w:tc>
         <w:tc>
           <w:tcPr>
-            <w:tcW w:type="dxa" w:w="3300"/>
-            <w:tcMar>
-              <w:top w:type="dxa" w:w="60"/>
-              <w:left w:type="dxa" w:w="90"/>
-              <w:bottom w:type="dxa" w:w="60"/>
-              <w:right w:type="dxa" w:w="90"/>
-            </w:tcMar>
-            <w:vAlign w:val="center"/>
-          </w:tcPr>
-          <w:p>
-            <w:pPr>
-              <w:bidi/>
-              <w:spacing w:after="40"/>
-              <w:jc w:val="start"/>
-            </w:pPr>
-            <w:r>
-              <w:rPr>
-                <w:rFonts w:ascii="David" w:cs="David" w:eastAsia="David" w:hAnsi="David"/>
-                <w:sz w:val="20"/>
-                <w:szCs w:val="20"/>
-                <w:rtl/>
-              </w:rPr>
-              <w:t xml:space="preserve">שבירת עשרת ראשונה בחיבור: אסטרטגיית ההשלמה לעשר</w:t>
-            </w:r>
-          </w:p>
-        </w:tc>
-        <w:tc>
-          <w:tcPr>
-            <w:tcW w:type="dxa" w:w="4660"/>
-            <w:tcMar>
-              <w:top w:type="dxa" w:w="60"/>
-              <w:left w:type="dxa" w:w="90"/>
-              <w:bottom w:type="dxa" w:w="60"/>
-              <w:right w:type="dxa" w:w="90"/>
-            </w:tcMar>
-            <w:vAlign w:val="center"/>
-          </w:tcPr>
-          <w:p>
-            <w:pPr>
-              <w:bidi/>
-              <w:spacing w:after="40"/>
-              <w:jc w:val="start"/>
-            </w:pPr>
-            <w:r>
-              <w:rPr>
-                <w:rFonts w:ascii="David" w:cs="David" w:eastAsia="David" w:hAnsi="David"/>
-                <w:sz w:val="20"/>
-                <w:szCs w:val="20"/>
-                <w:rtl/>
-              </w:rPr>
-              <w:t xml:space="preserve">"עשר כנקודת מוצא": מסגרות עשר ודסקיות (8+5 נבנה כ-8+2+3), מעבר לייצוג תמונתי וסמלי. תרגול במשחק דידקטי (קלפים ומשחק מסלול) ובסביבה מתוקשבת מסביבות הלמידה שהוצגו בקורס.</w:t>
-            </w:r>
-          </w:p>
-        </w:tc>
-      </w:tr>
-      <w:tr>
-        <w:tc>
-          <w:tcPr>
-            <w:tcW w:type="dxa" w:w="1300"/>
+            <w:tcW w:type="dxa" w:w="1750"/>
+            <w:tcMar>
+              <w:top w:type="dxa" w:w="60"/>
+              <w:left w:type="dxa" w:w="90"/>
+              <w:bottom w:type="dxa" w:w="60"/>
+              <w:right w:type="dxa" w:w="90"/>
+            </w:tcMar>
+            <w:vAlign w:val="center"/>
+          </w:tcPr>
+          <w:p>
+            <w:pPr>
+              <w:bidi/>
+              <w:spacing w:after="40"/>
+              <w:jc w:val="start"/>
+            </w:pPr>
+            <w:r>
+              <w:rPr>
+                <w:rFonts w:ascii="David" w:cs="David" w:eastAsia="David" w:hAnsi="David"/>
+                <w:sz w:val="20"/>
+                <w:szCs w:val="20"/>
+                <w:rtl/>
+              </w:rPr>
+              <w:t xml:space="preserve">שבירת עשרת ראשונה בחיבור: השלמה לעשר</w:t>
+            </w:r>
+          </w:p>
+        </w:tc>
+        <w:tc>
+          <w:tcPr>
+            <w:tcW w:type="dxa" w:w="2600"/>
+            <w:tcMar>
+              <w:top w:type="dxa" w:w="60"/>
+              <w:left w:type="dxa" w:w="90"/>
+              <w:bottom w:type="dxa" w:w="60"/>
+              <w:right w:type="dxa" w:w="90"/>
+            </w:tcMar>
+            <w:vAlign w:val="center"/>
+          </w:tcPr>
+          <w:p>
+            <w:pPr>
+              <w:bidi/>
+              <w:spacing w:after="40"/>
+              <w:jc w:val="start"/>
+            </w:pPr>
+            <w:r>
+              <w:rPr>
+                <w:rFonts w:ascii="David" w:cs="David" w:eastAsia="David" w:hAnsi="David"/>
+                <w:sz w:val="20"/>
+                <w:szCs w:val="20"/>
+                <w:rtl/>
+              </w:rPr>
+              <w:t xml:space="preserve">יפתור 8+5 ו-9+6 במסגרות עשר תוך פירוק המחובר השני (8+2+3).</w:t>
+            </w:r>
+          </w:p>
+          <w:p>
+            <w:pPr>
+              <w:bidi/>
+              <w:spacing w:after="40"/>
+              <w:jc w:val="start"/>
+            </w:pPr>
+            <w:r>
+              <w:rPr>
+                <w:rFonts w:ascii="David" w:cs="David" w:eastAsia="David" w:hAnsi="David"/>
+                <w:sz w:val="20"/>
+                <w:szCs w:val="20"/>
+                <w:rtl/>
+              </w:rPr>
+              <w:t xml:space="preserve">יפתור תרגילי מחובר גדול וקטן בדרג התמונתי.</w:t>
+            </w:r>
+          </w:p>
+          <w:p>
+            <w:pPr>
+              <w:bidi/>
+              <w:spacing w:after="40"/>
+              <w:jc w:val="start"/>
+            </w:pPr>
+            <w:r>
+              <w:rPr>
+                <w:rFonts w:ascii="David" w:cs="David" w:eastAsia="David" w:hAnsi="David"/>
+                <w:sz w:val="20"/>
+                <w:szCs w:val="20"/>
+                <w:rtl/>
+              </w:rPr>
+              <w:t xml:space="preserve">ידייק ב-4 מתוך 5 תרגילים בדרג הסמלי, ללא מנייה באצבעות.</w:t>
+            </w:r>
+          </w:p>
+        </w:tc>
+        <w:tc>
+          <w:tcPr>
+            <w:tcW w:type="dxa" w:w="2650"/>
+            <w:tcMar>
+              <w:top w:type="dxa" w:w="60"/>
+              <w:left w:type="dxa" w:w="90"/>
+              <w:bottom w:type="dxa" w:w="60"/>
+              <w:right w:type="dxa" w:w="90"/>
+            </w:tcMar>
+            <w:vAlign w:val="center"/>
+          </w:tcPr>
+          <w:p>
+            <w:pPr>
+              <w:bidi/>
+              <w:spacing w:after="40"/>
+              <w:jc w:val="start"/>
+            </w:pPr>
+            <w:r>
+              <w:rPr>
+                <w:rFonts w:ascii="David" w:cs="David" w:eastAsia="David" w:hAnsi="David"/>
+                <w:sz w:val="20"/>
+                <w:szCs w:val="20"/>
+                <w:rtl/>
+              </w:rPr>
+              <w:t xml:space="preserve">"עשר כנקודת מוצא": מסגרות עשר ודסקיות, מעבר לייצוג תמונתי וסמלי. תרגול במשחק דידקטי (קלפים, משחק מסלול) ובסביבת למידה מתוקשבת מהקורס. "עוקפים ולא תוקפים": פירוק דרך 10 במקום מנייה.</w:t>
+            </w:r>
+          </w:p>
+        </w:tc>
+        <w:tc>
+          <w:tcPr>
+            <w:tcW w:type="dxa" w:w="1460"/>
+            <w:tcMar>
+              <w:top w:type="dxa" w:w="60"/>
+              <w:left w:type="dxa" w:w="90"/>
+              <w:bottom w:type="dxa" w:w="60"/>
+              <w:right w:type="dxa" w:w="90"/>
+            </w:tcMar>
+            <w:vAlign w:val="center"/>
+          </w:tcPr>
+          <w:p>
+            <w:pPr>
+              <w:bidi/>
+              <w:spacing w:after="40"/>
+              <w:jc w:val="start"/>
+            </w:pPr>
+            <w:r>
+              <w:rPr>
+                <w:rFonts w:ascii="David" w:cs="David" w:eastAsia="David" w:hAnsi="David"/>
+                <w:sz w:val="20"/>
+                <w:szCs w:val="20"/>
+                <w:rtl/>
+              </w:rPr>
+              <w:t xml:space="preserve">השוואה ישירה לתרגילי המיפוי שנכשלו (8+5=12, 9+6=16).</w:t>
+            </w:r>
+          </w:p>
+        </w:tc>
+      </w:tr>
+      <w:tr>
+        <w:tc>
+          <w:tcPr>
+            <w:tcW w:type="dxa" w:w="800"/>
             <w:tcMar>
               <w:top w:type="dxa" w:w="60"/>
               <w:left w:type="dxa" w:w="90"/>
@@ -20042,7 +20518,7 @@
         </w:tc>
         <w:tc>
           <w:tcPr>
-            <w:tcW w:type="dxa" w:w="3300"/>
+            <w:tcW w:type="dxa" w:w="1750"/>
             <w:tcMar>
               <w:top w:type="dxa" w:w="60"/>
               <w:left w:type="dxa" w:w="90"/>
@@ -20070,37 +20546,109 @@
         </w:tc>
         <w:tc>
           <w:tcPr>
-            <w:tcW w:type="dxa" w:w="4660"/>
-            <w:tcMar>
-              <w:top w:type="dxa" w:w="60"/>
-              <w:left w:type="dxa" w:w="90"/>
-              <w:bottom w:type="dxa" w:w="60"/>
-              <w:right w:type="dxa" w:w="90"/>
-            </w:tcMar>
-            <w:vAlign w:val="center"/>
-          </w:tcPr>
-          <w:p>
-            <w:pPr>
-              <w:bidi/>
-              <w:spacing w:after="40"/>
-              <w:jc w:val="start"/>
-            </w:pPr>
-            <w:r>
-              <w:rPr>
-                <w:rFonts w:ascii="David" w:cs="David" w:eastAsia="David" w:hAnsi="David"/>
-                <w:sz w:val="20"/>
-                <w:szCs w:val="20"/>
-                <w:rtl/>
-              </w:rPr>
-              <w:t xml:space="preserve">תרגול משחקי: לוטו, דומינו ומשחקי זיכרון של תרגיל ותוצאה, להפחתת ההישענות על מנייה באצבעות. "עוקפים ולא תוקפים": עובדות שטרם נשלפות נתמכות בתבניות ולא בשינון עקר.</w:t>
-            </w:r>
-          </w:p>
-        </w:tc>
-      </w:tr>
-      <w:tr>
-        <w:tc>
-          <w:tcPr>
-            <w:tcW w:type="dxa" w:w="1300"/>
+            <w:tcW w:type="dxa" w:w="2600"/>
+            <w:tcMar>
+              <w:top w:type="dxa" w:w="60"/>
+              <w:left w:type="dxa" w:w="90"/>
+              <w:bottom w:type="dxa" w:w="60"/>
+              <w:right w:type="dxa" w:w="90"/>
+            </w:tcMar>
+            <w:vAlign w:val="center"/>
+          </w:tcPr>
+          <w:p>
+            <w:pPr>
+              <w:bidi/>
+              <w:spacing w:after="40"/>
+              <w:jc w:val="start"/>
+            </w:pPr>
+            <w:r>
+              <w:rPr>
+                <w:rFonts w:ascii="David" w:cs="David" w:eastAsia="David" w:hAnsi="David"/>
+                <w:sz w:val="20"/>
+                <w:szCs w:val="20"/>
+                <w:rtl/>
+              </w:rPr>
+              <w:t xml:space="preserve">ישלוף 8 מתוך 10 עובדות במשחק בזק ללא אצבעות.</w:t>
+            </w:r>
+          </w:p>
+          <w:p>
+            <w:pPr>
+              <w:bidi/>
+              <w:spacing w:after="40"/>
+              <w:jc w:val="start"/>
+            </w:pPr>
+            <w:r>
+              <w:rPr>
+                <w:rFonts w:ascii="David" w:cs="David" w:eastAsia="David" w:hAnsi="David"/>
+                <w:sz w:val="20"/>
+                <w:szCs w:val="20"/>
+                <w:rtl/>
+              </w:rPr>
+              <w:t xml:space="preserve">ישתמש בהישענות על תאומים (6+7 דרך 6+6).</w:t>
+            </w:r>
+          </w:p>
+        </w:tc>
+        <w:tc>
+          <w:tcPr>
+            <w:tcW w:type="dxa" w:w="2650"/>
+            <w:tcMar>
+              <w:top w:type="dxa" w:w="60"/>
+              <w:left w:type="dxa" w:w="90"/>
+              <w:bottom w:type="dxa" w:w="60"/>
+              <w:right w:type="dxa" w:w="90"/>
+            </w:tcMar>
+            <w:vAlign w:val="center"/>
+          </w:tcPr>
+          <w:p>
+            <w:pPr>
+              <w:bidi/>
+              <w:spacing w:after="40"/>
+              <w:jc w:val="start"/>
+            </w:pPr>
+            <w:r>
+              <w:rPr>
+                <w:rFonts w:ascii="David" w:cs="David" w:eastAsia="David" w:hAnsi="David"/>
+                <w:sz w:val="20"/>
+                <w:szCs w:val="20"/>
+                <w:rtl/>
+              </w:rPr>
+              <w:t xml:space="preserve">תרגול משחקי: לוטו, דומינו ומשחקי זיכרון של תרגיל ותוצאה. עובדות שטרם נשלפות נתמכות בתבניות ליי ולא בשינון עקר.</w:t>
+            </w:r>
+          </w:p>
+        </w:tc>
+        <w:tc>
+          <w:tcPr>
+            <w:tcW w:type="dxa" w:w="1460"/>
+            <w:tcMar>
+              <w:top w:type="dxa" w:w="60"/>
+              <w:left w:type="dxa" w:w="90"/>
+              <w:bottom w:type="dxa" w:w="60"/>
+              <w:right w:type="dxa" w:w="90"/>
+            </w:tcMar>
+            <w:vAlign w:val="center"/>
+          </w:tcPr>
+          <w:p>
+            <w:pPr>
+              <w:bidi/>
+              <w:spacing w:after="40"/>
+              <w:jc w:val="start"/>
+            </w:pPr>
+            <w:r>
+              <w:rPr>
+                <w:rFonts w:ascii="David" w:cs="David" w:eastAsia="David" w:hAnsi="David"/>
+                <w:sz w:val="20"/>
+                <w:szCs w:val="20"/>
+                <w:rtl/>
+              </w:rPr>
+              <w:t xml:space="preserve">מבדק בזק של 10 עובדות בתחילת השיעור ובסופו.</w:t>
+            </w:r>
+          </w:p>
+        </w:tc>
+      </w:tr>
+      <w:tr>
+        <w:tc>
+          <w:tcPr>
+            <w:tcW w:type="dxa" w:w="800"/>
             <w:tcMar>
               <w:top w:type="dxa" w:w="60"/>
               <w:left w:type="dxa" w:w="90"/>
@@ -20128,7 +20676,7 @@
         </w:tc>
         <w:tc>
           <w:tcPr>
-            <w:tcW w:type="dxa" w:w="3300"/>
+            <w:tcW w:type="dxa" w:w="1750"/>
             <w:tcMar>
               <w:top w:type="dxa" w:w="60"/>
               <w:left w:type="dxa" w:w="90"/>
@@ -20156,37 +20704,125 @@
         </w:tc>
         <w:tc>
           <w:tcPr>
-            <w:tcW w:type="dxa" w:w="4660"/>
-            <w:tcMar>
-              <w:top w:type="dxa" w:w="60"/>
-              <w:left w:type="dxa" w:w="90"/>
-              <w:bottom w:type="dxa" w:w="60"/>
-              <w:right w:type="dxa" w:w="90"/>
-            </w:tcMar>
-            <w:vAlign w:val="center"/>
-          </w:tcPr>
-          <w:p>
-            <w:pPr>
-              <w:bidi/>
-              <w:spacing w:after="40"/>
-              <w:jc w:val="start"/>
-            </w:pPr>
-            <w:r>
-              <w:rPr>
-                <w:rFonts w:ascii="David" w:cs="David" w:eastAsia="David" w:hAnsi="David"/>
-                <w:sz w:val="20"/>
-                <w:szCs w:val="20"/>
-                <w:rtl/>
-              </w:rPr>
-              <w:t xml:space="preserve">ביצוע מקביל: בדידים על טבלת ערך מקום לצד הכתיב במאונך, עד ביצוע עצמאי בדרג הסמלי. סימון ההתקדמות בטבלה המצטברת.</w:t>
-            </w:r>
-          </w:p>
-        </w:tc>
-      </w:tr>
-      <w:tr>
-        <w:tc>
-          <w:tcPr>
-            <w:tcW w:type="dxa" w:w="1300"/>
+            <w:tcW w:type="dxa" w:w="2600"/>
+            <w:tcMar>
+              <w:top w:type="dxa" w:w="60"/>
+              <w:left w:type="dxa" w:w="90"/>
+              <w:bottom w:type="dxa" w:w="60"/>
+              <w:right w:type="dxa" w:w="90"/>
+            </w:tcMar>
+            <w:vAlign w:val="center"/>
+          </w:tcPr>
+          <w:p>
+            <w:pPr>
+              <w:bidi/>
+              <w:spacing w:after="40"/>
+              <w:jc w:val="start"/>
+            </w:pPr>
+            <w:r>
+              <w:rPr>
+                <w:rFonts w:ascii="David" w:cs="David" w:eastAsia="David" w:hAnsi="David"/>
+                <w:sz w:val="20"/>
+                <w:szCs w:val="20"/>
+                <w:rtl/>
+              </w:rPr>
+              <w:t xml:space="preserve">יפתור 57+25 ודומיו במקביל: בבדידים על טבלת ערך מקום ובכתיב במאונך.</w:t>
+            </w:r>
+          </w:p>
+          <w:p>
+            <w:pPr>
+              <w:bidi/>
+              <w:spacing w:after="40"/>
+              <w:jc w:val="start"/>
+            </w:pPr>
+            <w:r>
+              <w:rPr>
+                <w:rFonts w:ascii="David" w:cs="David" w:eastAsia="David" w:hAnsi="David"/>
+                <w:sz w:val="20"/>
+                <w:szCs w:val="20"/>
+                <w:rtl/>
+              </w:rPr>
+              <w:t xml:space="preserve">יסביר את משמעות ה"1 הקטן" המועבר לטור העשרות.</w:t>
+            </w:r>
+          </w:p>
+          <w:p>
+            <w:pPr>
+              <w:bidi/>
+              <w:spacing w:after="40"/>
+              <w:jc w:val="start"/>
+            </w:pPr>
+            <w:r>
+              <w:rPr>
+                <w:rFonts w:ascii="David" w:cs="David" w:eastAsia="David" w:hAnsi="David"/>
+                <w:sz w:val="20"/>
+                <w:szCs w:val="20"/>
+                <w:rtl/>
+              </w:rPr>
+              <w:t xml:space="preserve">יפתור 4 מתוך 5 תרגילים עצמאית בדרג הסמלי.</w:t>
+            </w:r>
+          </w:p>
+        </w:tc>
+        <w:tc>
+          <w:tcPr>
+            <w:tcW w:type="dxa" w:w="2650"/>
+            <w:tcMar>
+              <w:top w:type="dxa" w:w="60"/>
+              <w:left w:type="dxa" w:w="90"/>
+              <w:bottom w:type="dxa" w:w="60"/>
+              <w:right w:type="dxa" w:w="90"/>
+            </w:tcMar>
+            <w:vAlign w:val="center"/>
+          </w:tcPr>
+          <w:p>
+            <w:pPr>
+              <w:bidi/>
+              <w:spacing w:after="40"/>
+              <w:jc w:val="start"/>
+            </w:pPr>
+            <w:r>
+              <w:rPr>
+                <w:rFonts w:ascii="David" w:cs="David" w:eastAsia="David" w:hAnsi="David"/>
+                <w:sz w:val="20"/>
+                <w:szCs w:val="20"/>
+                <w:rtl/>
+              </w:rPr>
+              <w:t xml:space="preserve">ביצוע מקביל מוחשי-כתוב עד הפנמה, ואז דעיכת האביזר. קוד צבע קבוע לעשרות ולאחדות. סימון ההתקדמות בטבלה המצטברת.</w:t>
+            </w:r>
+          </w:p>
+        </w:tc>
+        <w:tc>
+          <w:tcPr>
+            <w:tcW w:type="dxa" w:w="1460"/>
+            <w:tcMar>
+              <w:top w:type="dxa" w:w="60"/>
+              <w:left w:type="dxa" w:w="90"/>
+              <w:bottom w:type="dxa" w:w="60"/>
+              <w:right w:type="dxa" w:w="90"/>
+            </w:tcMar>
+            <w:vAlign w:val="center"/>
+          </w:tcPr>
+          <w:p>
+            <w:pPr>
+              <w:bidi/>
+              <w:spacing w:after="40"/>
+              <w:jc w:val="start"/>
+            </w:pPr>
+            <w:r>
+              <w:rPr>
+                <w:rFonts w:ascii="David" w:cs="David" w:eastAsia="David" w:hAnsi="David"/>
+                <w:sz w:val="20"/>
+                <w:szCs w:val="20"/>
+                <w:rtl/>
+              </w:rPr>
+              <w:t xml:space="preserve">חמישה תרגילים מדורגים; השוואה מפורשת לטעות המיפוי (712=57+25).</w:t>
+            </w:r>
+          </w:p>
+        </w:tc>
+      </w:tr>
+      <w:tr>
+        <w:tc>
+          <w:tcPr>
+            <w:tcW w:type="dxa" w:w="800"/>
             <w:tcMar>
               <w:top w:type="dxa" w:w="60"/>
               <w:left w:type="dxa" w:w="90"/>
@@ -20214,7 +20850,7 @@
         </w:tc>
         <w:tc>
           <w:tcPr>
-            <w:tcW w:type="dxa" w:w="3300"/>
+            <w:tcW w:type="dxa" w:w="1750"/>
             <w:tcMar>
               <w:top w:type="dxa" w:w="60"/>
               <w:left w:type="dxa" w:w="90"/>
@@ -20242,37 +20878,125 @@
         </w:tc>
         <w:tc>
           <w:tcPr>
-            <w:tcW w:type="dxa" w:w="4660"/>
-            <w:tcMar>
-              <w:top w:type="dxa" w:w="60"/>
-              <w:left w:type="dxa" w:w="90"/>
-              <w:bottom w:type="dxa" w:w="60"/>
-              <w:right w:type="dxa" w:w="90"/>
-            </w:tcMar>
-            <w:vAlign w:val="center"/>
-          </w:tcPr>
-          <w:p>
-            <w:pPr>
-              <w:bidi/>
-              <w:spacing w:after="40"/>
-              <w:jc w:val="start"/>
-            </w:pPr>
-            <w:r>
-              <w:rPr>
-                <w:rFonts w:ascii="David" w:cs="David" w:eastAsia="David" w:hAnsi="David"/>
-                <w:sz w:val="20"/>
-                <w:szCs w:val="20"/>
-                <w:rtl/>
-              </w:rPr>
-              <w:t xml:space="preserve">פריטת עשרת בטבלת ערך המקום כמענה לטעות השיטתית "תמיד מחסרים קטן מגדול"; השוואה מפורשת בין תרגילים עם פריטה ובלעדיה.</w:t>
-            </w:r>
-          </w:p>
-        </w:tc>
-      </w:tr>
-      <w:tr>
-        <w:tc>
-          <w:tcPr>
-            <w:tcW w:type="dxa" w:w="1300"/>
+            <w:tcW w:type="dxa" w:w="2600"/>
+            <w:tcMar>
+              <w:top w:type="dxa" w:w="60"/>
+              <w:left w:type="dxa" w:w="90"/>
+              <w:bottom w:type="dxa" w:w="60"/>
+              <w:right w:type="dxa" w:w="90"/>
+            </w:tcMar>
+            <w:vAlign w:val="center"/>
+          </w:tcPr>
+          <w:p>
+            <w:pPr>
+              <w:bidi/>
+              <w:spacing w:after="40"/>
+              <w:jc w:val="start"/>
+            </w:pPr>
+            <w:r>
+              <w:rPr>
+                <w:rFonts w:ascii="David" w:cs="David" w:eastAsia="David" w:hAnsi="David"/>
+                <w:sz w:val="20"/>
+                <w:szCs w:val="20"/>
+                <w:rtl/>
+              </w:rPr>
+              <w:t xml:space="preserve">ימיין תרגילים ל"צריך פריטה" ו"לא צריך פריטה" (5 מתוך 6).</w:t>
+            </w:r>
+          </w:p>
+          <w:p>
+            <w:pPr>
+              <w:bidi/>
+              <w:spacing w:after="40"/>
+              <w:jc w:val="start"/>
+            </w:pPr>
+            <w:r>
+              <w:rPr>
+                <w:rFonts w:ascii="David" w:cs="David" w:eastAsia="David" w:hAnsi="David"/>
+                <w:sz w:val="20"/>
+                <w:szCs w:val="20"/>
+                <w:rtl/>
+              </w:rPr>
+              <w:t xml:space="preserve">יפתור 43-27 נכון תוך פריטת עשרת בטבלת ערך המקום.</w:t>
+            </w:r>
+          </w:p>
+          <w:p>
+            <w:pPr>
+              <w:bidi/>
+              <w:spacing w:after="40"/>
+              <w:jc w:val="start"/>
+            </w:pPr>
+            <w:r>
+              <w:rPr>
+                <w:rFonts w:ascii="David" w:cs="David" w:eastAsia="David" w:hAnsi="David"/>
+                <w:sz w:val="20"/>
+                <w:szCs w:val="20"/>
+                <w:rtl/>
+              </w:rPr>
+              <w:t xml:space="preserve">יסביר מדוע אסור "להפוך" את הספרות.</w:t>
+            </w:r>
+          </w:p>
+        </w:tc>
+        <w:tc>
+          <w:tcPr>
+            <w:tcW w:type="dxa" w:w="2650"/>
+            <w:tcMar>
+              <w:top w:type="dxa" w:w="60"/>
+              <w:left w:type="dxa" w:w="90"/>
+              <w:bottom w:type="dxa" w:w="60"/>
+              <w:right w:type="dxa" w:w="90"/>
+            </w:tcMar>
+            <w:vAlign w:val="center"/>
+          </w:tcPr>
+          <w:p>
+            <w:pPr>
+              <w:bidi/>
+              <w:spacing w:after="40"/>
+              <w:jc w:val="start"/>
+            </w:pPr>
+            <w:r>
+              <w:rPr>
+                <w:rFonts w:ascii="David" w:cs="David" w:eastAsia="David" w:hAnsi="David"/>
+                <w:sz w:val="20"/>
+                <w:szCs w:val="20"/>
+                <w:rtl/>
+              </w:rPr>
+              <w:t xml:space="preserve">פריטת עשרת בטבלת ערך המקום כמענה ישיר לטעות "תמיד מחסרים קטן מגדול". כרטיסי מיון, והשוואה מפורשת בין תרגילים עם פריטה ובלעדיה.</w:t>
+            </w:r>
+          </w:p>
+        </w:tc>
+        <w:tc>
+          <w:tcPr>
+            <w:tcW w:type="dxa" w:w="1460"/>
+            <w:tcMar>
+              <w:top w:type="dxa" w:w="60"/>
+              <w:left w:type="dxa" w:w="90"/>
+              <w:bottom w:type="dxa" w:w="60"/>
+              <w:right w:type="dxa" w:w="90"/>
+            </w:tcMar>
+            <w:vAlign w:val="center"/>
+          </w:tcPr>
+          <w:p>
+            <w:pPr>
+              <w:bidi/>
+              <w:spacing w:after="40"/>
+              <w:jc w:val="start"/>
+            </w:pPr>
+            <w:r>
+              <w:rPr>
+                <w:rFonts w:ascii="David" w:cs="David" w:eastAsia="David" w:hAnsi="David"/>
+                <w:sz w:val="20"/>
+                <w:szCs w:val="20"/>
+                <w:rtl/>
+              </w:rPr>
+              <w:t xml:space="preserve">מיון ופתרון; השוואה לטעות המיפוי (24=43-27).</w:t>
+            </w:r>
+          </w:p>
+        </w:tc>
+      </w:tr>
+      <w:tr>
+        <w:tc>
+          <w:tcPr>
+            <w:tcW w:type="dxa" w:w="800"/>
             <w:tcMar>
               <w:top w:type="dxa" w:w="60"/>
               <w:left w:type="dxa" w:w="90"/>
@@ -20300,7 +21024,7 @@
         </w:tc>
         <w:tc>
           <w:tcPr>
-            <w:tcW w:type="dxa" w:w="3300"/>
+            <w:tcW w:type="dxa" w:w="1750"/>
             <w:tcMar>
               <w:top w:type="dxa" w:w="60"/>
               <w:left w:type="dxa" w:w="90"/>
@@ -20328,34 +21052,122 @@
         </w:tc>
         <w:tc>
           <w:tcPr>
-            <w:tcW w:type="dxa" w:w="4660"/>
-            <w:tcMar>
-              <w:top w:type="dxa" w:w="60"/>
-              <w:left w:type="dxa" w:w="90"/>
-              <w:bottom w:type="dxa" w:w="60"/>
-              <w:right w:type="dxa" w:w="90"/>
-            </w:tcMar>
-            <w:vAlign w:val="center"/>
-          </w:tcPr>
-          <w:p>
-            <w:pPr>
-              <w:bidi/>
-              <w:spacing w:after="40"/>
-              <w:jc w:val="start"/>
-            </w:pPr>
-            <w:r>
-              <w:rPr>
-                <w:rFonts w:ascii="David" w:cs="David" w:eastAsia="David" w:hAnsi="David"/>
-                <w:sz w:val="20"/>
-                <w:szCs w:val="20"/>
-                <w:rtl/>
-              </w:rPr>
-              <w:t xml:space="preserve">פתרון בעיות חד-שלביות ודו-שלביות מחיי היומיום (כסף, קניות). מיפוי חוזר ממוקד בעזרת טבלאות הניתוח החשבוני להערכת ההתקדמות ולתכנון ההמשך, והדבקת מדבקת סיום בטבלה המצטברת.</w:t>
+            <w:tcW w:type="dxa" w:w="2600"/>
+            <w:tcMar>
+              <w:top w:type="dxa" w:w="60"/>
+              <w:left w:type="dxa" w:w="90"/>
+              <w:bottom w:type="dxa" w:w="60"/>
+              <w:right w:type="dxa" w:w="90"/>
+            </w:tcMar>
+            <w:vAlign w:val="center"/>
+          </w:tcPr>
+          <w:p>
+            <w:pPr>
+              <w:bidi/>
+              <w:spacing w:after="40"/>
+              <w:jc w:val="start"/>
+            </w:pPr>
+            <w:r>
+              <w:rPr>
+                <w:rFonts w:ascii="David" w:cs="David" w:eastAsia="David" w:hAnsi="David"/>
+                <w:sz w:val="20"/>
+                <w:szCs w:val="20"/>
+                <w:rtl/>
+              </w:rPr>
+              <w:t xml:space="preserve">יפתור שתי בעיות מילוליות חד-שלביות ובעיה דו-שלבית אחת בהקשר של כסף וקניות.</w:t>
+            </w:r>
+          </w:p>
+          <w:p>
+            <w:pPr>
+              <w:bidi/>
+              <w:spacing w:after="40"/>
+              <w:jc w:val="start"/>
+            </w:pPr>
+            <w:r>
+              <w:rPr>
+                <w:rFonts w:ascii="David" w:cs="David" w:eastAsia="David" w:hAnsi="David"/>
+                <w:sz w:val="20"/>
+                <w:szCs w:val="20"/>
+                <w:rtl/>
+              </w:rPr>
+              <w:t xml:space="preserve">ישתתף במיפוי חוזר ממוקד.</w:t>
+            </w:r>
+          </w:p>
+        </w:tc>
+        <w:tc>
+          <w:tcPr>
+            <w:tcW w:type="dxa" w:w="2650"/>
+            <w:tcMar>
+              <w:top w:type="dxa" w:w="60"/>
+              <w:left w:type="dxa" w:w="90"/>
+              <w:bottom w:type="dxa" w:w="60"/>
+              <w:right w:type="dxa" w:w="90"/>
+            </w:tcMar>
+            <w:vAlign w:val="center"/>
+          </w:tcPr>
+          <w:p>
+            <w:pPr>
+              <w:bidi/>
+              <w:spacing w:after="40"/>
+              <w:jc w:val="start"/>
+            </w:pPr>
+            <w:r>
+              <w:rPr>
+                <w:rFonts w:ascii="David" w:cs="David" w:eastAsia="David" w:hAnsi="David"/>
+                <w:sz w:val="20"/>
+                <w:szCs w:val="20"/>
+                <w:rtl/>
+              </w:rPr>
+              <w:t xml:space="preserve">סיטואציית "חנות" עם מטבעות ורשימת קניות. מיפוי חוזר בעזרת טבלאות הניתוח החשבוני ועדכון עמודת "אמצע שנה". מדבקת סיום בטבלה המצטברת.</w:t>
+            </w:r>
+          </w:p>
+        </w:tc>
+        <w:tc>
+          <w:tcPr>
+            <w:tcW w:type="dxa" w:w="1460"/>
+            <w:tcMar>
+              <w:top w:type="dxa" w:w="60"/>
+              <w:left w:type="dxa" w:w="90"/>
+              <w:bottom w:type="dxa" w:w="60"/>
+              <w:right w:type="dxa" w:w="90"/>
+            </w:tcMar>
+            <w:vAlign w:val="center"/>
+          </w:tcPr>
+          <w:p>
+            <w:pPr>
+              <w:bidi/>
+              <w:spacing w:after="40"/>
+              <w:jc w:val="start"/>
+            </w:pPr>
+            <w:r>
+              <w:rPr>
+                <w:rFonts w:ascii="David" w:cs="David" w:eastAsia="David" w:hAnsi="David"/>
+                <w:sz w:val="20"/>
+                <w:szCs w:val="20"/>
+                <w:rtl/>
+              </w:rPr>
+              <w:t xml:space="preserve">השוואת דירוגי "אמצע שנה" לדירוגי תחילת השנה ותכנון המשך.</w:t>
             </w:r>
           </w:p>
         </w:tc>
       </w:tr>
     </w:tbl>
+    <w:p>
+      <w:pPr>
+        <w:bidi/>
+        <w:spacing w:after="120" w:before="120"/>
+        <w:jc w:val="start"/>
+      </w:pPr>
+      <w:r>
+        <w:rPr>
+          <w:rFonts w:ascii="David" w:cs="David" w:eastAsia="David" w:hAnsi="David"/>
+          <w:sz w:val="22"/>
+          <w:szCs w:val="22"/>
+          <w:rtl/>
+        </w:rPr>
+        <w:t xml:space="preserve">נספח לתוכנית: חוברת האבחון המלאה עם ביצועי התלמיד בכל סעיף מצורפת בקובץ נפרד ("אבחון המספרים השלמים, מלא"). מערכי השיעורים 1 ו-3 מצורפים אף הם בקבצים נפרדים.</w:t>
+      </w:r>
+    </w:p>
     <w:p>
       <w:pPr>
         <w:bidi/>

</xml_diff>